<commit_message>
Yayın: foseptik prefabrik polietilen tanka çevrildi
Hibe dışı yapım işleri 5.845.091,09 TL; uygun harcama değişmedi
15.720.192,50 TL = 297.965 Avro.

Co-Authored-By: Claude Opus 5 <noreply@anthropic.com>
Claude-Session: https://claude.ai/code/session_01HJPp6bx7wepUX5p8fxGcjg
</commit_message>
<xml_diff>
--- a/belgeler/04_METRAJ_CETVELI_AGIRLIK.docx
+++ b/belgeler/04_METRAJ_CETVELI_AGIRLIK.docx
@@ -18822,7 +18822,7 @@
                 <w:color w:val="000000"/>
                 <w:sz w:val="16"/>
               </w:rPr>
-              <w:t>5,462225</w:t>
+              <w:t>4,875600</w:t>
             </w:r>
           </w:p>
         </w:tc>
@@ -18874,7 +18874,7 @@
                 <w:color w:val="000000"/>
                 <w:sz w:val="16"/>
               </w:rPr>
-              <w:t>Yapı/Bina Adı: FOSEPTIK</w:t>
+              <w:t>Yapı/Bina Adı: YEM SILOSU BETONARME KAIDELERI</w:t>
             </w:r>
           </w:p>
         </w:tc>
@@ -19447,7 +19447,7 @@
                 <w:color w:val="000000"/>
                 <w:sz w:val="16"/>
               </w:rPr>
-              <w:t>Radye 2,00 x 2,00 x 0,30 m³; 95 kg/m³</w:t>
+              <w:t>Kaideler 2,90 x 2,90 x 0,50 m³, 2 adet; 90 kg/m³</w:t>
             </w:r>
           </w:p>
         </w:tc>
@@ -19491,6 +19491,33 @@
                 <w:color w:val="000000"/>
                 <w:sz w:val="16"/>
               </w:rPr>
+              <w:t>2</w:t>
+            </w:r>
+          </w:p>
+        </w:tc>
+        <w:tc>
+          <w:tcPr>
+            <w:tcW w:type="dxa" w:w="785"/>
+            <w:tcBorders>
+              <w:top w:val="single" w:sz="4" w:space="0" w:color="808080"/>
+              <w:left w:val="single" w:sz="4" w:space="0" w:color="808080"/>
+              <w:bottom w:val="single" w:sz="4" w:space="0" w:color="808080"/>
+              <w:right w:val="single" w:sz="4" w:space="0" w:color="808080"/>
+            </w:tcBorders>
+          </w:tcPr>
+          <w:p>
+            <w:pPr>
+              <w:spacing w:before="20" w:after="20"/>
+              <w:jc w:val="left"/>
+            </w:pPr>
+            <w:r>
+              <w:rPr>
+                <w:rFonts w:ascii="Calibri" w:hAnsi="Calibri"/>
+                <w:b w:val="0"/>
+                <w:i w:val="0"/>
+                <w:color w:val="000000"/>
+                <w:sz w:val="16"/>
+              </w:rPr>
               <w:t>1</w:t>
             </w:r>
           </w:p>
@@ -19518,7 +19545,7 @@
                 <w:color w:val="000000"/>
                 <w:sz w:val="16"/>
               </w:rPr>
-              <w:t>1</w:t>
+              <w:t>8,410</w:t>
             </w:r>
           </w:p>
         </w:tc>
@@ -19545,34 +19572,7 @@
                 <w:color w:val="000000"/>
                 <w:sz w:val="16"/>
               </w:rPr>
-              <w:t>4,000</w:t>
-            </w:r>
-          </w:p>
-        </w:tc>
-        <w:tc>
-          <w:tcPr>
-            <w:tcW w:type="dxa" w:w="785"/>
-            <w:tcBorders>
-              <w:top w:val="single" w:sz="4" w:space="0" w:color="808080"/>
-              <w:left w:val="single" w:sz="4" w:space="0" w:color="808080"/>
-              <w:bottom w:val="single" w:sz="4" w:space="0" w:color="808080"/>
-              <w:right w:val="single" w:sz="4" w:space="0" w:color="808080"/>
-            </w:tcBorders>
-          </w:tcPr>
-          <w:p>
-            <w:pPr>
-              <w:spacing w:before="20" w:after="20"/>
-              <w:jc w:val="left"/>
-            </w:pPr>
-            <w:r>
-              <w:rPr>
-                <w:rFonts w:ascii="Calibri" w:hAnsi="Calibri"/>
-                <w:b w:val="0"/>
-                <w:i w:val="0"/>
-                <w:color w:val="000000"/>
-                <w:sz w:val="16"/>
-              </w:rPr>
-              <w:t>0,300</w:t>
+              <w:t>0,500</w:t>
             </w:r>
           </w:p>
         </w:tc>
@@ -19626,7 +19626,7 @@
                 <w:color w:val="000000"/>
                 <w:sz w:val="16"/>
               </w:rPr>
-              <w:t>0,095000</w:t>
+              <w:t>0,090000</w:t>
             </w:r>
           </w:p>
         </w:tc>
@@ -19653,7 +19653,7 @@
                 <w:color w:val="000000"/>
                 <w:sz w:val="16"/>
               </w:rPr>
-              <w:t>0,114000</w:t>
+              <w:t>0,756900</w:t>
             </w:r>
           </w:p>
         </w:tc>
@@ -19694,12 +19694,12 @@
             <w:r>
               <w:rPr>
                 <w:rFonts w:ascii="Calibri" w:hAnsi="Calibri"/>
-                <w:b w:val="0"/>
-                <w:i w:val="0"/>
-                <w:color w:val="000000"/>
-                <w:sz w:val="16"/>
-              </w:rPr>
-              <w:t>Perdeler 7,00 x 0,25 x 2,50 m³; 95 kg/m³</w:t>
+                <w:b/>
+                <w:i w:val="0"/>
+                <w:color w:val="000000"/>
+                <w:sz w:val="16"/>
+              </w:rPr>
+              <w:t>M26 GENEL TOPLAM</w:t>
             </w:r>
           </w:p>
         </w:tc>
@@ -19718,6 +19718,16 @@
               <w:spacing w:before="20" w:after="20"/>
               <w:jc w:val="left"/>
             </w:pPr>
+            <w:r>
+              <w:rPr>
+                <w:rFonts w:ascii="Calibri" w:hAnsi="Calibri"/>
+                <w:b w:val="0"/>
+                <w:i w:val="0"/>
+                <w:color w:val="000000"/>
+                <w:sz w:val="16"/>
+              </w:rPr>
+              <w:t>ton</w:t>
+            </w:r>
           </w:p>
         </w:tc>
         <w:tc>
@@ -19735,16 +19745,6 @@
               <w:spacing w:before="20" w:after="20"/>
               <w:jc w:val="left"/>
             </w:pPr>
-            <w:r>
-              <w:rPr>
-                <w:rFonts w:ascii="Calibri" w:hAnsi="Calibri"/>
-                <w:b w:val="0"/>
-                <w:i w:val="0"/>
-                <w:color w:val="000000"/>
-                <w:sz w:val="16"/>
-              </w:rPr>
-              <w:t>1</w:t>
-            </w:r>
           </w:p>
         </w:tc>
         <w:tc>
@@ -19762,16 +19762,6 @@
               <w:spacing w:before="20" w:after="20"/>
               <w:jc w:val="left"/>
             </w:pPr>
-            <w:r>
-              <w:rPr>
-                <w:rFonts w:ascii="Calibri" w:hAnsi="Calibri"/>
-                <w:b w:val="0"/>
-                <w:i w:val="0"/>
-                <w:color w:val="000000"/>
-                <w:sz w:val="16"/>
-              </w:rPr>
-              <w:t>1</w:t>
-            </w:r>
           </w:p>
         </w:tc>
         <w:tc>
@@ -19789,16 +19779,6 @@
               <w:spacing w:before="20" w:after="20"/>
               <w:jc w:val="left"/>
             </w:pPr>
-            <w:r>
-              <w:rPr>
-                <w:rFonts w:ascii="Calibri" w:hAnsi="Calibri"/>
-                <w:b w:val="0"/>
-                <w:i w:val="0"/>
-                <w:color w:val="000000"/>
-                <w:sz w:val="16"/>
-              </w:rPr>
-              <w:t>1,750</w:t>
-            </w:r>
           </w:p>
         </w:tc>
         <w:tc>
@@ -19816,16 +19796,6 @@
               <w:spacing w:before="20" w:after="20"/>
               <w:jc w:val="left"/>
             </w:pPr>
-            <w:r>
-              <w:rPr>
-                <w:rFonts w:ascii="Calibri" w:hAnsi="Calibri"/>
-                <w:b w:val="0"/>
-                <w:i w:val="0"/>
-                <w:color w:val="000000"/>
-                <w:sz w:val="16"/>
-              </w:rPr>
-              <w:t>2,500</w:t>
-            </w:r>
           </w:p>
         </w:tc>
         <w:tc>
@@ -19843,16 +19813,6 @@
               <w:spacing w:before="20" w:after="20"/>
               <w:jc w:val="left"/>
             </w:pPr>
-            <w:r>
-              <w:rPr>
-                <w:rFonts w:ascii="Calibri" w:hAnsi="Calibri"/>
-                <w:b w:val="0"/>
-                <w:i w:val="0"/>
-                <w:color w:val="000000"/>
-                <w:sz w:val="16"/>
-              </w:rPr>
-              <w:t>ø8-12 nervürlü</w:t>
-            </w:r>
           </w:p>
         </w:tc>
         <w:tc>
@@ -19870,16 +19830,6 @@
               <w:spacing w:before="20" w:after="20"/>
               <w:jc w:val="left"/>
             </w:pPr>
-            <w:r>
-              <w:rPr>
-                <w:rFonts w:ascii="Calibri" w:hAnsi="Calibri"/>
-                <w:b w:val="0"/>
-                <w:i w:val="0"/>
-                <w:color w:val="000000"/>
-                <w:sz w:val="16"/>
-              </w:rPr>
-              <w:t>0,095000</w:t>
-            </w:r>
           </w:p>
         </w:tc>
         <w:tc>
@@ -19905,461 +19855,7 @@
                 <w:color w:val="000000"/>
                 <w:sz w:val="16"/>
               </w:rPr>
-              <w:t>0,415625</w:t>
-            </w:r>
-          </w:p>
-        </w:tc>
-      </w:tr>
-      <w:tr>
-        <w:tc>
-          <w:tcPr>
-            <w:tcW w:type="dxa" w:w="1178"/>
-            <w:tcBorders>
-              <w:top w:val="single" w:sz="4" w:space="0" w:color="808080"/>
-              <w:left w:val="single" w:sz="4" w:space="0" w:color="808080"/>
-              <w:bottom w:val="single" w:sz="4" w:space="0" w:color="808080"/>
-              <w:right w:val="single" w:sz="4" w:space="0" w:color="808080"/>
-            </w:tcBorders>
-          </w:tcPr>
-          <w:p>
-            <w:pPr>
-              <w:spacing w:before="20" w:after="20"/>
-              <w:jc w:val="left"/>
-            </w:pPr>
-          </w:p>
-        </w:tc>
-        <w:tc>
-          <w:tcPr>
-            <w:tcW w:type="dxa" w:w="1346"/>
-            <w:tcBorders>
-              <w:top w:val="single" w:sz="4" w:space="0" w:color="808080"/>
-              <w:left w:val="single" w:sz="4" w:space="0" w:color="808080"/>
-              <w:bottom w:val="single" w:sz="4" w:space="0" w:color="808080"/>
-              <w:right w:val="single" w:sz="4" w:space="0" w:color="808080"/>
-            </w:tcBorders>
-          </w:tcPr>
-          <w:p>
-            <w:pPr>
-              <w:spacing w:before="20" w:after="20"/>
-              <w:jc w:val="left"/>
-            </w:pPr>
-            <w:r>
-              <w:rPr>
-                <w:rFonts w:ascii="Calibri" w:hAnsi="Calibri"/>
-                <w:b w:val="0"/>
-                <w:i w:val="0"/>
-                <w:color w:val="000000"/>
-                <w:sz w:val="16"/>
-              </w:rPr>
-              <w:t>Üst döşeme 2,00 x 2,00 x 0,15 m³; 95 kg/m³</w:t>
-            </w:r>
-          </w:p>
-        </w:tc>
-        <w:tc>
-          <w:tcPr>
-            <w:tcW w:type="dxa" w:w="617"/>
-            <w:tcBorders>
-              <w:top w:val="single" w:sz="4" w:space="0" w:color="808080"/>
-              <w:left w:val="single" w:sz="4" w:space="0" w:color="808080"/>
-              <w:bottom w:val="single" w:sz="4" w:space="0" w:color="808080"/>
-              <w:right w:val="single" w:sz="4" w:space="0" w:color="808080"/>
-            </w:tcBorders>
-          </w:tcPr>
-          <w:p>
-            <w:pPr>
-              <w:spacing w:before="20" w:after="20"/>
-              <w:jc w:val="left"/>
-            </w:pPr>
-          </w:p>
-        </w:tc>
-        <w:tc>
-          <w:tcPr>
-            <w:tcW w:type="dxa" w:w="785"/>
-            <w:tcBorders>
-              <w:top w:val="single" w:sz="4" w:space="0" w:color="808080"/>
-              <w:left w:val="single" w:sz="4" w:space="0" w:color="808080"/>
-              <w:bottom w:val="single" w:sz="4" w:space="0" w:color="808080"/>
-              <w:right w:val="single" w:sz="4" w:space="0" w:color="808080"/>
-            </w:tcBorders>
-          </w:tcPr>
-          <w:p>
-            <w:pPr>
-              <w:spacing w:before="20" w:after="20"/>
-              <w:jc w:val="left"/>
-            </w:pPr>
-            <w:r>
-              <w:rPr>
-                <w:rFonts w:ascii="Calibri" w:hAnsi="Calibri"/>
-                <w:b w:val="0"/>
-                <w:i w:val="0"/>
-                <w:color w:val="000000"/>
-                <w:sz w:val="16"/>
-              </w:rPr>
-              <w:t>1</w:t>
-            </w:r>
-          </w:p>
-        </w:tc>
-        <w:tc>
-          <w:tcPr>
-            <w:tcW w:type="dxa" w:w="785"/>
-            <w:tcBorders>
-              <w:top w:val="single" w:sz="4" w:space="0" w:color="808080"/>
-              <w:left w:val="single" w:sz="4" w:space="0" w:color="808080"/>
-              <w:bottom w:val="single" w:sz="4" w:space="0" w:color="808080"/>
-              <w:right w:val="single" w:sz="4" w:space="0" w:color="808080"/>
-            </w:tcBorders>
-          </w:tcPr>
-          <w:p>
-            <w:pPr>
-              <w:spacing w:before="20" w:after="20"/>
-              <w:jc w:val="left"/>
-            </w:pPr>
-            <w:r>
-              <w:rPr>
-                <w:rFonts w:ascii="Calibri" w:hAnsi="Calibri"/>
-                <w:b w:val="0"/>
-                <w:i w:val="0"/>
-                <w:color w:val="000000"/>
-                <w:sz w:val="16"/>
-              </w:rPr>
-              <w:t>1</w:t>
-            </w:r>
-          </w:p>
-        </w:tc>
-        <w:tc>
-          <w:tcPr>
-            <w:tcW w:type="dxa" w:w="785"/>
-            <w:tcBorders>
-              <w:top w:val="single" w:sz="4" w:space="0" w:color="808080"/>
-              <w:left w:val="single" w:sz="4" w:space="0" w:color="808080"/>
-              <w:bottom w:val="single" w:sz="4" w:space="0" w:color="808080"/>
-              <w:right w:val="single" w:sz="4" w:space="0" w:color="808080"/>
-            </w:tcBorders>
-          </w:tcPr>
-          <w:p>
-            <w:pPr>
-              <w:spacing w:before="20" w:after="20"/>
-              <w:jc w:val="left"/>
-            </w:pPr>
-            <w:r>
-              <w:rPr>
-                <w:rFonts w:ascii="Calibri" w:hAnsi="Calibri"/>
-                <w:b w:val="0"/>
-                <w:i w:val="0"/>
-                <w:color w:val="000000"/>
-                <w:sz w:val="16"/>
-              </w:rPr>
-              <w:t>4,000</w:t>
-            </w:r>
-          </w:p>
-        </w:tc>
-        <w:tc>
-          <w:tcPr>
-            <w:tcW w:type="dxa" w:w="785"/>
-            <w:tcBorders>
-              <w:top w:val="single" w:sz="4" w:space="0" w:color="808080"/>
-              <w:left w:val="single" w:sz="4" w:space="0" w:color="808080"/>
-              <w:bottom w:val="single" w:sz="4" w:space="0" w:color="808080"/>
-              <w:right w:val="single" w:sz="4" w:space="0" w:color="808080"/>
-            </w:tcBorders>
-          </w:tcPr>
-          <w:p>
-            <w:pPr>
-              <w:spacing w:before="20" w:after="20"/>
-              <w:jc w:val="left"/>
-            </w:pPr>
-            <w:r>
-              <w:rPr>
-                <w:rFonts w:ascii="Calibri" w:hAnsi="Calibri"/>
-                <w:b w:val="0"/>
-                <w:i w:val="0"/>
-                <w:color w:val="000000"/>
-                <w:sz w:val="16"/>
-              </w:rPr>
-              <w:t>0,150</w:t>
-            </w:r>
-          </w:p>
-        </w:tc>
-        <w:tc>
-          <w:tcPr>
-            <w:tcW w:type="dxa" w:w="1682"/>
-            <w:tcBorders>
-              <w:top w:val="single" w:sz="4" w:space="0" w:color="808080"/>
-              <w:left w:val="single" w:sz="4" w:space="0" w:color="808080"/>
-              <w:bottom w:val="single" w:sz="4" w:space="0" w:color="808080"/>
-              <w:right w:val="single" w:sz="4" w:space="0" w:color="808080"/>
-            </w:tcBorders>
-          </w:tcPr>
-          <w:p>
-            <w:pPr>
-              <w:spacing w:before="20" w:after="20"/>
-              <w:jc w:val="left"/>
-            </w:pPr>
-            <w:r>
-              <w:rPr>
-                <w:rFonts w:ascii="Calibri" w:hAnsi="Calibri"/>
-                <w:b w:val="0"/>
-                <w:i w:val="0"/>
-                <w:color w:val="000000"/>
-                <w:sz w:val="16"/>
-              </w:rPr>
-              <w:t>ø8-12 nervürlü</w:t>
-            </w:r>
-          </w:p>
-        </w:tc>
-        <w:tc>
-          <w:tcPr>
-            <w:tcW w:type="dxa" w:w="1234"/>
-            <w:tcBorders>
-              <w:top w:val="single" w:sz="4" w:space="0" w:color="808080"/>
-              <w:left w:val="single" w:sz="4" w:space="0" w:color="808080"/>
-              <w:bottom w:val="single" w:sz="4" w:space="0" w:color="808080"/>
-              <w:right w:val="single" w:sz="4" w:space="0" w:color="808080"/>
-            </w:tcBorders>
-          </w:tcPr>
-          <w:p>
-            <w:pPr>
-              <w:spacing w:before="20" w:after="20"/>
-              <w:jc w:val="left"/>
-            </w:pPr>
-            <w:r>
-              <w:rPr>
-                <w:rFonts w:ascii="Calibri" w:hAnsi="Calibri"/>
-                <w:b w:val="0"/>
-                <w:i w:val="0"/>
-                <w:color w:val="000000"/>
-                <w:sz w:val="16"/>
-              </w:rPr>
-              <w:t>0,095000</w:t>
-            </w:r>
-          </w:p>
-        </w:tc>
-        <w:tc>
-          <w:tcPr>
-            <w:tcW w:type="dxa" w:w="1234"/>
-            <w:tcBorders>
-              <w:top w:val="single" w:sz="4" w:space="0" w:color="808080"/>
-              <w:left w:val="single" w:sz="4" w:space="0" w:color="808080"/>
-              <w:bottom w:val="single" w:sz="4" w:space="0" w:color="808080"/>
-              <w:right w:val="single" w:sz="4" w:space="0" w:color="808080"/>
-            </w:tcBorders>
-          </w:tcPr>
-          <w:p>
-            <w:pPr>
-              <w:spacing w:before="20" w:after="20"/>
-              <w:jc w:val="left"/>
-            </w:pPr>
-            <w:r>
-              <w:rPr>
-                <w:rFonts w:ascii="Calibri" w:hAnsi="Calibri"/>
-                <w:b w:val="0"/>
-                <w:i w:val="0"/>
-                <w:color w:val="000000"/>
-                <w:sz w:val="16"/>
-              </w:rPr>
-              <w:t>0,057000</w:t>
-            </w:r>
-          </w:p>
-        </w:tc>
-      </w:tr>
-      <w:tr>
-        <w:tc>
-          <w:tcPr>
-            <w:tcW w:type="dxa" w:w="1178"/>
-            <w:tcBorders>
-              <w:top w:val="single" w:sz="4" w:space="0" w:color="808080"/>
-              <w:left w:val="single" w:sz="4" w:space="0" w:color="808080"/>
-              <w:bottom w:val="single" w:sz="4" w:space="0" w:color="808080"/>
-              <w:right w:val="single" w:sz="4" w:space="0" w:color="808080"/>
-            </w:tcBorders>
-          </w:tcPr>
-          <w:p>
-            <w:pPr>
-              <w:spacing w:before="20" w:after="20"/>
-              <w:jc w:val="left"/>
-            </w:pPr>
-          </w:p>
-        </w:tc>
-        <w:tc>
-          <w:tcPr>
-            <w:tcW w:type="dxa" w:w="1346"/>
-            <w:tcBorders>
-              <w:top w:val="single" w:sz="4" w:space="0" w:color="808080"/>
-              <w:left w:val="single" w:sz="4" w:space="0" w:color="808080"/>
-              <w:bottom w:val="single" w:sz="4" w:space="0" w:color="808080"/>
-              <w:right w:val="single" w:sz="4" w:space="0" w:color="808080"/>
-            </w:tcBorders>
-          </w:tcPr>
-          <w:p>
-            <w:pPr>
-              <w:spacing w:before="20" w:after="20"/>
-              <w:jc w:val="left"/>
-            </w:pPr>
-            <w:r>
-              <w:rPr>
-                <w:rFonts w:ascii="Calibri" w:hAnsi="Calibri"/>
-                <w:b/>
-                <w:i w:val="0"/>
-                <w:color w:val="000000"/>
-                <w:sz w:val="16"/>
-              </w:rPr>
-              <w:t>M26 GENEL TOPLAM</w:t>
-            </w:r>
-          </w:p>
-        </w:tc>
-        <w:tc>
-          <w:tcPr>
-            <w:tcW w:type="dxa" w:w="617"/>
-            <w:tcBorders>
-              <w:top w:val="single" w:sz="4" w:space="0" w:color="808080"/>
-              <w:left w:val="single" w:sz="4" w:space="0" w:color="808080"/>
-              <w:bottom w:val="single" w:sz="4" w:space="0" w:color="808080"/>
-              <w:right w:val="single" w:sz="4" w:space="0" w:color="808080"/>
-            </w:tcBorders>
-          </w:tcPr>
-          <w:p>
-            <w:pPr>
-              <w:spacing w:before="20" w:after="20"/>
-              <w:jc w:val="left"/>
-            </w:pPr>
-            <w:r>
-              <w:rPr>
-                <w:rFonts w:ascii="Calibri" w:hAnsi="Calibri"/>
-                <w:b w:val="0"/>
-                <w:i w:val="0"/>
-                <w:color w:val="000000"/>
-                <w:sz w:val="16"/>
-              </w:rPr>
-              <w:t>ton</w:t>
-            </w:r>
-          </w:p>
-        </w:tc>
-        <w:tc>
-          <w:tcPr>
-            <w:tcW w:type="dxa" w:w="785"/>
-            <w:tcBorders>
-              <w:top w:val="single" w:sz="4" w:space="0" w:color="808080"/>
-              <w:left w:val="single" w:sz="4" w:space="0" w:color="808080"/>
-              <w:bottom w:val="single" w:sz="4" w:space="0" w:color="808080"/>
-              <w:right w:val="single" w:sz="4" w:space="0" w:color="808080"/>
-            </w:tcBorders>
-          </w:tcPr>
-          <w:p>
-            <w:pPr>
-              <w:spacing w:before="20" w:after="20"/>
-              <w:jc w:val="left"/>
-            </w:pPr>
-          </w:p>
-        </w:tc>
-        <w:tc>
-          <w:tcPr>
-            <w:tcW w:type="dxa" w:w="785"/>
-            <w:tcBorders>
-              <w:top w:val="single" w:sz="4" w:space="0" w:color="808080"/>
-              <w:left w:val="single" w:sz="4" w:space="0" w:color="808080"/>
-              <w:bottom w:val="single" w:sz="4" w:space="0" w:color="808080"/>
-              <w:right w:val="single" w:sz="4" w:space="0" w:color="808080"/>
-            </w:tcBorders>
-          </w:tcPr>
-          <w:p>
-            <w:pPr>
-              <w:spacing w:before="20" w:after="20"/>
-              <w:jc w:val="left"/>
-            </w:pPr>
-          </w:p>
-        </w:tc>
-        <w:tc>
-          <w:tcPr>
-            <w:tcW w:type="dxa" w:w="785"/>
-            <w:tcBorders>
-              <w:top w:val="single" w:sz="4" w:space="0" w:color="808080"/>
-              <w:left w:val="single" w:sz="4" w:space="0" w:color="808080"/>
-              <w:bottom w:val="single" w:sz="4" w:space="0" w:color="808080"/>
-              <w:right w:val="single" w:sz="4" w:space="0" w:color="808080"/>
-            </w:tcBorders>
-          </w:tcPr>
-          <w:p>
-            <w:pPr>
-              <w:spacing w:before="20" w:after="20"/>
-              <w:jc w:val="left"/>
-            </w:pPr>
-          </w:p>
-        </w:tc>
-        <w:tc>
-          <w:tcPr>
-            <w:tcW w:type="dxa" w:w="785"/>
-            <w:tcBorders>
-              <w:top w:val="single" w:sz="4" w:space="0" w:color="808080"/>
-              <w:left w:val="single" w:sz="4" w:space="0" w:color="808080"/>
-              <w:bottom w:val="single" w:sz="4" w:space="0" w:color="808080"/>
-              <w:right w:val="single" w:sz="4" w:space="0" w:color="808080"/>
-            </w:tcBorders>
-          </w:tcPr>
-          <w:p>
-            <w:pPr>
-              <w:spacing w:before="20" w:after="20"/>
-              <w:jc w:val="left"/>
-            </w:pPr>
-          </w:p>
-        </w:tc>
-        <w:tc>
-          <w:tcPr>
-            <w:tcW w:type="dxa" w:w="1682"/>
-            <w:tcBorders>
-              <w:top w:val="single" w:sz="4" w:space="0" w:color="808080"/>
-              <w:left w:val="single" w:sz="4" w:space="0" w:color="808080"/>
-              <w:bottom w:val="single" w:sz="4" w:space="0" w:color="808080"/>
-              <w:right w:val="single" w:sz="4" w:space="0" w:color="808080"/>
-            </w:tcBorders>
-          </w:tcPr>
-          <w:p>
-            <w:pPr>
-              <w:spacing w:before="20" w:after="20"/>
-              <w:jc w:val="left"/>
-            </w:pPr>
-          </w:p>
-        </w:tc>
-        <w:tc>
-          <w:tcPr>
-            <w:tcW w:type="dxa" w:w="1234"/>
-            <w:tcBorders>
-              <w:top w:val="single" w:sz="4" w:space="0" w:color="808080"/>
-              <w:left w:val="single" w:sz="4" w:space="0" w:color="808080"/>
-              <w:bottom w:val="single" w:sz="4" w:space="0" w:color="808080"/>
-              <w:right w:val="single" w:sz="4" w:space="0" w:color="808080"/>
-            </w:tcBorders>
-          </w:tcPr>
-          <w:p>
-            <w:pPr>
-              <w:spacing w:before="20" w:after="20"/>
-              <w:jc w:val="left"/>
-            </w:pPr>
-          </w:p>
-        </w:tc>
-        <w:tc>
-          <w:tcPr>
-            <w:tcW w:type="dxa" w:w="1234"/>
-            <w:tcBorders>
-              <w:top w:val="single" w:sz="4" w:space="0" w:color="808080"/>
-              <w:left w:val="single" w:sz="4" w:space="0" w:color="808080"/>
-              <w:bottom w:val="single" w:sz="4" w:space="0" w:color="808080"/>
-              <w:right w:val="single" w:sz="4" w:space="0" w:color="808080"/>
-            </w:tcBorders>
-          </w:tcPr>
-          <w:p>
-            <w:pPr>
-              <w:spacing w:before="20" w:after="20"/>
-              <w:jc w:val="left"/>
-            </w:pPr>
-            <w:r>
-              <w:rPr>
-                <w:rFonts w:ascii="Calibri" w:hAnsi="Calibri"/>
-                <w:b w:val="0"/>
-                <w:i w:val="0"/>
-                <w:color w:val="000000"/>
-                <w:sz w:val="16"/>
-              </w:rPr>
-              <w:t>5,462225</w:t>
+              <w:t>4,875600</w:t>
             </w:r>
           </w:p>
         </w:tc>
@@ -20411,7 +19907,7 @@
                 <w:color w:val="000000"/>
                 <w:sz w:val="16"/>
               </w:rPr>
-              <w:t>Yapı/Bina Adı: YEM SILOSU BETONARME KAIDELERI</w:t>
+              <w:t>Yapı/Bina Adı: SU DEPOSU</w:t>
             </w:r>
           </w:p>
         </w:tc>
@@ -20984,7 +20480,7 @@
                 <w:color w:val="000000"/>
                 <w:sz w:val="16"/>
               </w:rPr>
-              <w:t>Kaideler 2,90 x 2,90 x 0,50 m³, 2 adet; 90 kg/m³</w:t>
+              <w:t>Radye ve üst döşeme — proje metrajı 223,70 + 32,90 = 256,60 kg</w:t>
             </w:r>
           </w:p>
         </w:tc>
@@ -21028,7 +20524,7 @@
                 <w:color w:val="000000"/>
                 <w:sz w:val="16"/>
               </w:rPr>
-              <w:t>2</w:t>
+              <w:t>1</w:t>
             </w:r>
           </w:p>
         </w:tc>
@@ -21074,16 +20570,6 @@
               <w:spacing w:before="20" w:after="20"/>
               <w:jc w:val="left"/>
             </w:pPr>
-            <w:r>
-              <w:rPr>
-                <w:rFonts w:ascii="Calibri" w:hAnsi="Calibri"/>
-                <w:b w:val="0"/>
-                <w:i w:val="0"/>
-                <w:color w:val="000000"/>
-                <w:sz w:val="16"/>
-              </w:rPr>
-              <w:t>8,410</w:t>
-            </w:r>
           </w:p>
         </w:tc>
         <w:tc>
@@ -21101,16 +20587,6 @@
               <w:spacing w:before="20" w:after="20"/>
               <w:jc w:val="left"/>
             </w:pPr>
-            <w:r>
-              <w:rPr>
-                <w:rFonts w:ascii="Calibri" w:hAnsi="Calibri"/>
-                <w:b w:val="0"/>
-                <w:i w:val="0"/>
-                <w:color w:val="000000"/>
-                <w:sz w:val="16"/>
-              </w:rPr>
-              <w:t>0,500</w:t>
-            </w:r>
           </w:p>
         </w:tc>
         <w:tc>
@@ -21163,7 +20639,7 @@
                 <w:color w:val="000000"/>
                 <w:sz w:val="16"/>
               </w:rPr>
-              <w:t>0,090000</w:t>
+              <w:t>0,256600</w:t>
             </w:r>
           </w:p>
         </w:tc>
@@ -21190,7 +20666,7 @@
                 <w:color w:val="000000"/>
                 <w:sz w:val="16"/>
               </w:rPr>
-              <w:t>0,756900</w:t>
+              <w:t>0,256600</w:t>
             </w:r>
           </w:p>
         </w:tc>
@@ -21231,12 +20707,12 @@
             <w:r>
               <w:rPr>
                 <w:rFonts w:ascii="Calibri" w:hAnsi="Calibri"/>
-                <w:b/>
-                <w:i w:val="0"/>
-                <w:color w:val="000000"/>
-                <w:sz w:val="16"/>
-              </w:rPr>
-              <w:t>M26 GENEL TOPLAM</w:t>
+                <w:b w:val="0"/>
+                <w:i w:val="0"/>
+                <w:color w:val="000000"/>
+                <w:sz w:val="16"/>
+              </w:rPr>
+              <w:t>Perdeler 13,00 x 0,25 x 3,00 m³; 100 kg/m³</w:t>
             </w:r>
           </w:p>
         </w:tc>
@@ -21255,16 +20731,6 @@
               <w:spacing w:before="20" w:after="20"/>
               <w:jc w:val="left"/>
             </w:pPr>
-            <w:r>
-              <w:rPr>
-                <w:rFonts w:ascii="Calibri" w:hAnsi="Calibri"/>
-                <w:b w:val="0"/>
-                <w:i w:val="0"/>
-                <w:color w:val="000000"/>
-                <w:sz w:val="16"/>
-              </w:rPr>
-              <w:t>ton</w:t>
-            </w:r>
           </w:p>
         </w:tc>
         <w:tc>
@@ -21282,6 +20748,16 @@
               <w:spacing w:before="20" w:after="20"/>
               <w:jc w:val="left"/>
             </w:pPr>
+            <w:r>
+              <w:rPr>
+                <w:rFonts w:ascii="Calibri" w:hAnsi="Calibri"/>
+                <w:b w:val="0"/>
+                <w:i w:val="0"/>
+                <w:color w:val="000000"/>
+                <w:sz w:val="16"/>
+              </w:rPr>
+              <w:t>1</w:t>
+            </w:r>
           </w:p>
         </w:tc>
         <w:tc>
@@ -21299,6 +20775,16 @@
               <w:spacing w:before="20" w:after="20"/>
               <w:jc w:val="left"/>
             </w:pPr>
+            <w:r>
+              <w:rPr>
+                <w:rFonts w:ascii="Calibri" w:hAnsi="Calibri"/>
+                <w:b w:val="0"/>
+                <w:i w:val="0"/>
+                <w:color w:val="000000"/>
+                <w:sz w:val="16"/>
+              </w:rPr>
+              <w:t>1</w:t>
+            </w:r>
           </w:p>
         </w:tc>
         <w:tc>
@@ -21316,6 +20802,16 @@
               <w:spacing w:before="20" w:after="20"/>
               <w:jc w:val="left"/>
             </w:pPr>
+            <w:r>
+              <w:rPr>
+                <w:rFonts w:ascii="Calibri" w:hAnsi="Calibri"/>
+                <w:b w:val="0"/>
+                <w:i w:val="0"/>
+                <w:color w:val="000000"/>
+                <w:sz w:val="16"/>
+              </w:rPr>
+              <w:t>3,250</w:t>
+            </w:r>
           </w:p>
         </w:tc>
         <w:tc>
@@ -21333,6 +20829,16 @@
               <w:spacing w:before="20" w:after="20"/>
               <w:jc w:val="left"/>
             </w:pPr>
+            <w:r>
+              <w:rPr>
+                <w:rFonts w:ascii="Calibri" w:hAnsi="Calibri"/>
+                <w:b w:val="0"/>
+                <w:i w:val="0"/>
+                <w:color w:val="000000"/>
+                <w:sz w:val="16"/>
+              </w:rPr>
+              <w:t>3,000</w:t>
+            </w:r>
           </w:p>
         </w:tc>
         <w:tc>
@@ -21350,6 +20856,16 @@
               <w:spacing w:before="20" w:after="20"/>
               <w:jc w:val="left"/>
             </w:pPr>
+            <w:r>
+              <w:rPr>
+                <w:rFonts w:ascii="Calibri" w:hAnsi="Calibri"/>
+                <w:b w:val="0"/>
+                <w:i w:val="0"/>
+                <w:color w:val="000000"/>
+                <w:sz w:val="16"/>
+              </w:rPr>
+              <w:t>ø8-12 nervürlü</w:t>
+            </w:r>
           </w:p>
         </w:tc>
         <w:tc>
@@ -21367,6 +20883,16 @@
               <w:spacing w:before="20" w:after="20"/>
               <w:jc w:val="left"/>
             </w:pPr>
+            <w:r>
+              <w:rPr>
+                <w:rFonts w:ascii="Calibri" w:hAnsi="Calibri"/>
+                <w:b w:val="0"/>
+                <w:i w:val="0"/>
+                <w:color w:val="000000"/>
+                <w:sz w:val="16"/>
+              </w:rPr>
+              <w:t>0,100000</w:t>
+            </w:r>
           </w:p>
         </w:tc>
         <w:tc>
@@ -21392,384 +20918,7 @@
                 <w:color w:val="000000"/>
                 <w:sz w:val="16"/>
               </w:rPr>
-              <w:t>5,462225</w:t>
-            </w:r>
-          </w:p>
-        </w:tc>
-      </w:tr>
-    </w:tbl>
-    <w:p>
-      <w:pPr>
-        <w:spacing w:after="80"/>
-      </w:pPr>
-    </w:p>
-    <w:p>
-      <w:pPr>
-        <w:spacing w:after="80"/>
-      </w:pPr>
-    </w:p>
-    <w:tbl>
-      <w:tblPr>
-        <w:tblW w:type="auto" w:w="0"/>
-        <w:jc w:val="center"/>
-        <w:tblLayout w:type="fixed"/>
-        <w:tblLook w:firstColumn="1" w:firstRow="1" w:lastColumn="0" w:lastRow="0" w:noHBand="0" w:noVBand="1" w:val="04A0"/>
-      </w:tblPr>
-      <w:tblGrid>
-        <w:gridCol w:w="5216"/>
-        <w:gridCol w:w="5216"/>
-      </w:tblGrid>
-      <w:tr>
-        <w:tc>
-          <w:tcPr>
-            <w:tcW w:type="dxa" w:w="8188"/>
-            <w:tcBorders>
-              <w:top w:val="single" w:sz="4" w:space="0" w:color="808080"/>
-              <w:left w:val="single" w:sz="4" w:space="0" w:color="808080"/>
-              <w:bottom w:val="single" w:sz="4" w:space="0" w:color="808080"/>
-              <w:right w:val="single" w:sz="4" w:space="0" w:color="808080"/>
-            </w:tcBorders>
-            <w:shd w:val="clear" w:color="auto" w:fill="EDEDED"/>
-          </w:tcPr>
-          <w:p>
-            <w:pPr>
-              <w:spacing w:before="20" w:after="20"/>
-              <w:jc w:val="left"/>
-            </w:pPr>
-            <w:r>
-              <w:rPr>
-                <w:rFonts w:ascii="Calibri" w:hAnsi="Calibri"/>
-                <w:b/>
-                <w:i w:val="0"/>
-                <w:color w:val="000000"/>
-                <w:sz w:val="16"/>
-              </w:rPr>
-              <w:t>Yapı/Bina Adı: SU DEPOSU</w:t>
-            </w:r>
-          </w:p>
-        </w:tc>
-        <w:tc>
-          <w:tcPr>
-            <w:tcW w:type="dxa" w:w="2243"/>
-            <w:tcBorders>
-              <w:top w:val="single" w:sz="4" w:space="0" w:color="808080"/>
-              <w:left w:val="single" w:sz="4" w:space="0" w:color="808080"/>
-              <w:bottom w:val="single" w:sz="4" w:space="0" w:color="808080"/>
-              <w:right w:val="single" w:sz="4" w:space="0" w:color="808080"/>
-            </w:tcBorders>
-            <w:shd w:val="clear" w:color="auto" w:fill="EDEDED"/>
-          </w:tcPr>
-          <w:p>
-            <w:pPr>
-              <w:spacing w:before="20" w:after="20"/>
-              <w:jc w:val="left"/>
-            </w:pPr>
-          </w:p>
-        </w:tc>
-      </w:tr>
-    </w:tbl>
-    <w:p>
-      <w:pPr>
-        <w:spacing w:after="80"/>
-      </w:pPr>
-    </w:p>
-    <w:tbl>
-      <w:tblPr>
-        <w:tblW w:type="auto" w:w="0"/>
-        <w:jc w:val="center"/>
-        <w:tblLayout w:type="fixed"/>
-        <w:tblLook w:firstColumn="1" w:firstRow="1" w:lastColumn="0" w:lastRow="0" w:noHBand="0" w:noVBand="1" w:val="04A0"/>
-      </w:tblPr>
-      <w:tblGrid>
-        <w:gridCol w:w="1043"/>
-        <w:gridCol w:w="1043"/>
-        <w:gridCol w:w="1043"/>
-        <w:gridCol w:w="1043"/>
-        <w:gridCol w:w="1043"/>
-        <w:gridCol w:w="1043"/>
-        <w:gridCol w:w="1043"/>
-        <w:gridCol w:w="1043"/>
-        <w:gridCol w:w="1043"/>
-        <w:gridCol w:w="1043"/>
-      </w:tblGrid>
-      <w:tr>
-        <w:tc>
-          <w:tcPr>
-            <w:tcW w:type="dxa" w:w="1178"/>
-            <w:tcBorders>
-              <w:top w:val="single" w:sz="4" w:space="0" w:color="808080"/>
-              <w:left w:val="single" w:sz="4" w:space="0" w:color="808080"/>
-              <w:bottom w:val="single" w:sz="4" w:space="0" w:color="808080"/>
-              <w:right w:val="single" w:sz="4" w:space="0" w:color="808080"/>
-            </w:tcBorders>
-            <w:shd w:val="clear" w:color="auto" w:fill="EDEDED"/>
-          </w:tcPr>
-          <w:p>
-            <w:pPr>
-              <w:spacing w:before="20" w:after="20"/>
-              <w:jc w:val="left"/>
-            </w:pPr>
-            <w:r>
-              <w:rPr>
-                <w:rFonts w:ascii="Calibri" w:hAnsi="Calibri"/>
-                <w:b w:val="0"/>
-                <w:i w:val="0"/>
-                <w:color w:val="000000"/>
-                <w:sz w:val="16"/>
-              </w:rPr>
-              <w:t>Poz No</w:t>
-            </w:r>
-          </w:p>
-        </w:tc>
-        <w:tc>
-          <w:tcPr>
-            <w:tcW w:type="dxa" w:w="1346"/>
-            <w:tcBorders>
-              <w:top w:val="single" w:sz="4" w:space="0" w:color="808080"/>
-              <w:left w:val="single" w:sz="4" w:space="0" w:color="808080"/>
-              <w:bottom w:val="single" w:sz="4" w:space="0" w:color="808080"/>
-              <w:right w:val="single" w:sz="4" w:space="0" w:color="808080"/>
-            </w:tcBorders>
-            <w:shd w:val="clear" w:color="auto" w:fill="EDEDED"/>
-          </w:tcPr>
-          <w:p>
-            <w:pPr>
-              <w:spacing w:before="20" w:after="20"/>
-              <w:jc w:val="left"/>
-            </w:pPr>
-            <w:r>
-              <w:rPr>
-                <w:rFonts w:ascii="Calibri" w:hAnsi="Calibri"/>
-                <w:b w:val="0"/>
-                <w:i w:val="0"/>
-                <w:color w:val="000000"/>
-                <w:sz w:val="16"/>
-              </w:rPr>
-              <w:t>Tanımı</w:t>
-            </w:r>
-          </w:p>
-        </w:tc>
-        <w:tc>
-          <w:tcPr>
-            <w:tcW w:type="dxa" w:w="617"/>
-            <w:tcBorders>
-              <w:top w:val="single" w:sz="4" w:space="0" w:color="808080"/>
-              <w:left w:val="single" w:sz="4" w:space="0" w:color="808080"/>
-              <w:bottom w:val="single" w:sz="4" w:space="0" w:color="808080"/>
-              <w:right w:val="single" w:sz="4" w:space="0" w:color="808080"/>
-            </w:tcBorders>
-            <w:shd w:val="clear" w:color="auto" w:fill="EDEDED"/>
-          </w:tcPr>
-          <w:p>
-            <w:pPr>
-              <w:spacing w:before="20" w:after="20"/>
-              <w:jc w:val="left"/>
-            </w:pPr>
-            <w:r>
-              <w:rPr>
-                <w:rFonts w:ascii="Calibri" w:hAnsi="Calibri"/>
-                <w:b w:val="0"/>
-                <w:i w:val="0"/>
-                <w:color w:val="000000"/>
-                <w:sz w:val="16"/>
-              </w:rPr>
-              <w:t>Birim</w:t>
-            </w:r>
-          </w:p>
-        </w:tc>
-        <w:tc>
-          <w:tcPr>
-            <w:tcW w:type="dxa" w:w="785"/>
-            <w:tcBorders>
-              <w:top w:val="single" w:sz="4" w:space="0" w:color="808080"/>
-              <w:left w:val="single" w:sz="4" w:space="0" w:color="808080"/>
-              <w:bottom w:val="single" w:sz="4" w:space="0" w:color="808080"/>
-              <w:right w:val="single" w:sz="4" w:space="0" w:color="808080"/>
-            </w:tcBorders>
-            <w:shd w:val="clear" w:color="auto" w:fill="EDEDED"/>
-          </w:tcPr>
-          <w:p>
-            <w:pPr>
-              <w:spacing w:before="20" w:after="20"/>
-              <w:jc w:val="left"/>
-            </w:pPr>
-            <w:r>
-              <w:rPr>
-                <w:rFonts w:ascii="Calibri" w:hAnsi="Calibri"/>
-                <w:b w:val="0"/>
-                <w:i w:val="0"/>
-                <w:color w:val="000000"/>
-                <w:sz w:val="16"/>
-              </w:rPr>
-              <w:t>Benzer</w:t>
-            </w:r>
-          </w:p>
-        </w:tc>
-        <w:tc>
-          <w:tcPr>
-            <w:tcW w:type="dxa" w:w="785"/>
-            <w:tcBorders>
-              <w:top w:val="single" w:sz="4" w:space="0" w:color="808080"/>
-              <w:left w:val="single" w:sz="4" w:space="0" w:color="808080"/>
-              <w:bottom w:val="single" w:sz="4" w:space="0" w:color="808080"/>
-              <w:right w:val="single" w:sz="4" w:space="0" w:color="808080"/>
-            </w:tcBorders>
-            <w:shd w:val="clear" w:color="auto" w:fill="EDEDED"/>
-          </w:tcPr>
-          <w:p>
-            <w:pPr>
-              <w:spacing w:before="20" w:after="20"/>
-              <w:jc w:val="left"/>
-            </w:pPr>
-            <w:r>
-              <w:rPr>
-                <w:rFonts w:ascii="Calibri" w:hAnsi="Calibri"/>
-                <w:b w:val="0"/>
-                <w:i w:val="0"/>
-                <w:color w:val="000000"/>
-                <w:sz w:val="16"/>
-              </w:rPr>
-              <w:t>Adet</w:t>
-            </w:r>
-          </w:p>
-        </w:tc>
-        <w:tc>
-          <w:tcPr>
-            <w:tcW w:type="dxa" w:w="785"/>
-            <w:tcBorders>
-              <w:top w:val="single" w:sz="4" w:space="0" w:color="808080"/>
-              <w:left w:val="single" w:sz="4" w:space="0" w:color="808080"/>
-              <w:bottom w:val="single" w:sz="4" w:space="0" w:color="808080"/>
-              <w:right w:val="single" w:sz="4" w:space="0" w:color="808080"/>
-            </w:tcBorders>
-            <w:shd w:val="clear" w:color="auto" w:fill="EDEDED"/>
-          </w:tcPr>
-          <w:p>
-            <w:pPr>
-              <w:spacing w:before="20" w:after="20"/>
-              <w:jc w:val="left"/>
-            </w:pPr>
-            <w:r>
-              <w:rPr>
-                <w:rFonts w:ascii="Calibri" w:hAnsi="Calibri"/>
-                <w:b w:val="0"/>
-                <w:i w:val="0"/>
-                <w:color w:val="000000"/>
-                <w:sz w:val="16"/>
-              </w:rPr>
-              <w:t>Boy (m)</w:t>
-            </w:r>
-          </w:p>
-        </w:tc>
-        <w:tc>
-          <w:tcPr>
-            <w:tcW w:type="dxa" w:w="785"/>
-            <w:tcBorders>
-              <w:top w:val="single" w:sz="4" w:space="0" w:color="808080"/>
-              <w:left w:val="single" w:sz="4" w:space="0" w:color="808080"/>
-              <w:bottom w:val="single" w:sz="4" w:space="0" w:color="808080"/>
-              <w:right w:val="single" w:sz="4" w:space="0" w:color="808080"/>
-            </w:tcBorders>
-            <w:shd w:val="clear" w:color="auto" w:fill="EDEDED"/>
-          </w:tcPr>
-          <w:p>
-            <w:pPr>
-              <w:spacing w:before="20" w:after="20"/>
-              <w:jc w:val="left"/>
-            </w:pPr>
-            <w:r>
-              <w:rPr>
-                <w:rFonts w:ascii="Calibri" w:hAnsi="Calibri"/>
-                <w:b w:val="0"/>
-                <w:i w:val="0"/>
-                <w:color w:val="000000"/>
-                <w:sz w:val="16"/>
-              </w:rPr>
-              <w:t>En (m)</w:t>
-            </w:r>
-          </w:p>
-        </w:tc>
-        <w:tc>
-          <w:tcPr>
-            <w:tcW w:type="dxa" w:w="1682"/>
-            <w:tcBorders>
-              <w:top w:val="single" w:sz="4" w:space="0" w:color="808080"/>
-              <w:left w:val="single" w:sz="4" w:space="0" w:color="808080"/>
-              <w:bottom w:val="single" w:sz="4" w:space="0" w:color="808080"/>
-              <w:right w:val="single" w:sz="4" w:space="0" w:color="808080"/>
-            </w:tcBorders>
-            <w:shd w:val="clear" w:color="auto" w:fill="EDEDED"/>
-          </w:tcPr>
-          <w:p>
-            <w:pPr>
-              <w:spacing w:before="20" w:after="20"/>
-              <w:jc w:val="left"/>
-            </w:pPr>
-            <w:r>
-              <w:rPr>
-                <w:rFonts w:ascii="Calibri" w:hAnsi="Calibri"/>
-                <w:b w:val="0"/>
-                <w:i w:val="0"/>
-                <w:color w:val="000000"/>
-                <w:sz w:val="16"/>
-              </w:rPr>
-              <w:t>Demir çapı veya profil tipi</w:t>
-            </w:r>
-          </w:p>
-        </w:tc>
-        <w:tc>
-          <w:tcPr>
-            <w:tcW w:type="dxa" w:w="1234"/>
-            <w:tcBorders>
-              <w:top w:val="single" w:sz="4" w:space="0" w:color="808080"/>
-              <w:left w:val="single" w:sz="4" w:space="0" w:color="808080"/>
-              <w:bottom w:val="single" w:sz="4" w:space="0" w:color="808080"/>
-              <w:right w:val="single" w:sz="4" w:space="0" w:color="808080"/>
-            </w:tcBorders>
-            <w:shd w:val="clear" w:color="auto" w:fill="EDEDED"/>
-          </w:tcPr>
-          <w:p>
-            <w:pPr>
-              <w:spacing w:before="20" w:after="20"/>
-              <w:jc w:val="left"/>
-            </w:pPr>
-            <w:r>
-              <w:rPr>
-                <w:rFonts w:ascii="Calibri" w:hAnsi="Calibri"/>
-                <w:b w:val="0"/>
-                <w:i w:val="0"/>
-                <w:color w:val="000000"/>
-                <w:sz w:val="16"/>
-              </w:rPr>
-              <w:t>Birim Ağırlık</w:t>
-            </w:r>
-          </w:p>
-        </w:tc>
-        <w:tc>
-          <w:tcPr>
-            <w:tcW w:type="dxa" w:w="1234"/>
-            <w:tcBorders>
-              <w:top w:val="single" w:sz="4" w:space="0" w:color="808080"/>
-              <w:left w:val="single" w:sz="4" w:space="0" w:color="808080"/>
-              <w:bottom w:val="single" w:sz="4" w:space="0" w:color="808080"/>
-              <w:right w:val="single" w:sz="4" w:space="0" w:color="808080"/>
-            </w:tcBorders>
-            <w:shd w:val="clear" w:color="auto" w:fill="EDEDED"/>
-          </w:tcPr>
-          <w:p>
-            <w:pPr>
-              <w:spacing w:before="20" w:after="20"/>
-              <w:jc w:val="left"/>
-            </w:pPr>
-            <w:r>
-              <w:rPr>
-                <w:rFonts w:ascii="Calibri" w:hAnsi="Calibri"/>
-                <w:b w:val="0"/>
-                <w:i w:val="0"/>
-                <w:color w:val="000000"/>
-                <w:sz w:val="16"/>
-              </w:rPr>
-              <w:t>Toplam Ağırlık</w:t>
+              <w:t>0,975000</w:t>
             </w:r>
           </w:p>
         </w:tc>
@@ -21790,16 +20939,6 @@
               <w:spacing w:before="20" w:after="20"/>
               <w:jc w:val="left"/>
             </w:pPr>
-            <w:r>
-              <w:rPr>
-                <w:rFonts w:ascii="Calibri" w:hAnsi="Calibri"/>
-                <w:b w:val="0"/>
-                <w:i w:val="0"/>
-                <w:color w:val="000000"/>
-                <w:sz w:val="16"/>
-              </w:rPr>
-              <w:t>15.160.1003</w:t>
-            </w:r>
           </w:p>
         </w:tc>
         <w:tc>
@@ -21825,7 +20964,7 @@
                 <w:color w:val="000000"/>
                 <w:sz w:val="16"/>
               </w:rPr>
-              <w:t>[M26]  Ø 8 - Ø 12 mm nervürlü beton çelik çubuğu, çubukların kesilmesi, bükülmesi ve yerine konulması</w:t>
+              <w:t>M26 GENEL TOPLAM</w:t>
             </w:r>
           </w:p>
         </w:tc>
@@ -21973,691 +21112,15 @@
               <w:spacing w:before="20" w:after="20"/>
               <w:jc w:val="left"/>
             </w:pPr>
-          </w:p>
-        </w:tc>
-      </w:tr>
-      <w:tr>
-        <w:tc>
-          <w:tcPr>
-            <w:tcW w:type="dxa" w:w="1178"/>
-            <w:tcBorders>
-              <w:top w:val="single" w:sz="4" w:space="0" w:color="808080"/>
-              <w:left w:val="single" w:sz="4" w:space="0" w:color="808080"/>
-              <w:bottom w:val="single" w:sz="4" w:space="0" w:color="808080"/>
-              <w:right w:val="single" w:sz="4" w:space="0" w:color="808080"/>
-            </w:tcBorders>
-          </w:tcPr>
-          <w:p>
-            <w:pPr>
-              <w:spacing w:before="20" w:after="20"/>
-              <w:jc w:val="left"/>
-            </w:pPr>
-          </w:p>
-        </w:tc>
-        <w:tc>
-          <w:tcPr>
-            <w:tcW w:type="dxa" w:w="1346"/>
-            <w:tcBorders>
-              <w:top w:val="single" w:sz="4" w:space="0" w:color="808080"/>
-              <w:left w:val="single" w:sz="4" w:space="0" w:color="808080"/>
-              <w:bottom w:val="single" w:sz="4" w:space="0" w:color="808080"/>
-              <w:right w:val="single" w:sz="4" w:space="0" w:color="808080"/>
-            </w:tcBorders>
-          </w:tcPr>
-          <w:p>
-            <w:pPr>
-              <w:spacing w:before="20" w:after="20"/>
-              <w:jc w:val="left"/>
-            </w:pPr>
-            <w:r>
-              <w:rPr>
-                <w:rFonts w:ascii="Calibri" w:hAnsi="Calibri"/>
-                <w:b w:val="0"/>
-                <w:i w:val="0"/>
-                <w:color w:val="000000"/>
-                <w:sz w:val="16"/>
-              </w:rPr>
-              <w:t>Radye ve üst döşeme — proje metrajı 223,70 + 32,90 = 256,60 kg</w:t>
-            </w:r>
-          </w:p>
-        </w:tc>
-        <w:tc>
-          <w:tcPr>
-            <w:tcW w:type="dxa" w:w="617"/>
-            <w:tcBorders>
-              <w:top w:val="single" w:sz="4" w:space="0" w:color="808080"/>
-              <w:left w:val="single" w:sz="4" w:space="0" w:color="808080"/>
-              <w:bottom w:val="single" w:sz="4" w:space="0" w:color="808080"/>
-              <w:right w:val="single" w:sz="4" w:space="0" w:color="808080"/>
-            </w:tcBorders>
-          </w:tcPr>
-          <w:p>
-            <w:pPr>
-              <w:spacing w:before="20" w:after="20"/>
-              <w:jc w:val="left"/>
-            </w:pPr>
-          </w:p>
-        </w:tc>
-        <w:tc>
-          <w:tcPr>
-            <w:tcW w:type="dxa" w:w="785"/>
-            <w:tcBorders>
-              <w:top w:val="single" w:sz="4" w:space="0" w:color="808080"/>
-              <w:left w:val="single" w:sz="4" w:space="0" w:color="808080"/>
-              <w:bottom w:val="single" w:sz="4" w:space="0" w:color="808080"/>
-              <w:right w:val="single" w:sz="4" w:space="0" w:color="808080"/>
-            </w:tcBorders>
-          </w:tcPr>
-          <w:p>
-            <w:pPr>
-              <w:spacing w:before="20" w:after="20"/>
-              <w:jc w:val="left"/>
-            </w:pPr>
-            <w:r>
-              <w:rPr>
-                <w:rFonts w:ascii="Calibri" w:hAnsi="Calibri"/>
-                <w:b w:val="0"/>
-                <w:i w:val="0"/>
-                <w:color w:val="000000"/>
-                <w:sz w:val="16"/>
-              </w:rPr>
-              <w:t>1</w:t>
-            </w:r>
-          </w:p>
-        </w:tc>
-        <w:tc>
-          <w:tcPr>
-            <w:tcW w:type="dxa" w:w="785"/>
-            <w:tcBorders>
-              <w:top w:val="single" w:sz="4" w:space="0" w:color="808080"/>
-              <w:left w:val="single" w:sz="4" w:space="0" w:color="808080"/>
-              <w:bottom w:val="single" w:sz="4" w:space="0" w:color="808080"/>
-              <w:right w:val="single" w:sz="4" w:space="0" w:color="808080"/>
-            </w:tcBorders>
-          </w:tcPr>
-          <w:p>
-            <w:pPr>
-              <w:spacing w:before="20" w:after="20"/>
-              <w:jc w:val="left"/>
-            </w:pPr>
-            <w:r>
-              <w:rPr>
-                <w:rFonts w:ascii="Calibri" w:hAnsi="Calibri"/>
-                <w:b w:val="0"/>
-                <w:i w:val="0"/>
-                <w:color w:val="000000"/>
-                <w:sz w:val="16"/>
-              </w:rPr>
-              <w:t>1</w:t>
-            </w:r>
-          </w:p>
-        </w:tc>
-        <w:tc>
-          <w:tcPr>
-            <w:tcW w:type="dxa" w:w="785"/>
-            <w:tcBorders>
-              <w:top w:val="single" w:sz="4" w:space="0" w:color="808080"/>
-              <w:left w:val="single" w:sz="4" w:space="0" w:color="808080"/>
-              <w:bottom w:val="single" w:sz="4" w:space="0" w:color="808080"/>
-              <w:right w:val="single" w:sz="4" w:space="0" w:color="808080"/>
-            </w:tcBorders>
-          </w:tcPr>
-          <w:p>
-            <w:pPr>
-              <w:spacing w:before="20" w:after="20"/>
-              <w:jc w:val="left"/>
-            </w:pPr>
-          </w:p>
-        </w:tc>
-        <w:tc>
-          <w:tcPr>
-            <w:tcW w:type="dxa" w:w="785"/>
-            <w:tcBorders>
-              <w:top w:val="single" w:sz="4" w:space="0" w:color="808080"/>
-              <w:left w:val="single" w:sz="4" w:space="0" w:color="808080"/>
-              <w:bottom w:val="single" w:sz="4" w:space="0" w:color="808080"/>
-              <w:right w:val="single" w:sz="4" w:space="0" w:color="808080"/>
-            </w:tcBorders>
-          </w:tcPr>
-          <w:p>
-            <w:pPr>
-              <w:spacing w:before="20" w:after="20"/>
-              <w:jc w:val="left"/>
-            </w:pPr>
-          </w:p>
-        </w:tc>
-        <w:tc>
-          <w:tcPr>
-            <w:tcW w:type="dxa" w:w="1682"/>
-            <w:tcBorders>
-              <w:top w:val="single" w:sz="4" w:space="0" w:color="808080"/>
-              <w:left w:val="single" w:sz="4" w:space="0" w:color="808080"/>
-              <w:bottom w:val="single" w:sz="4" w:space="0" w:color="808080"/>
-              <w:right w:val="single" w:sz="4" w:space="0" w:color="808080"/>
-            </w:tcBorders>
-          </w:tcPr>
-          <w:p>
-            <w:pPr>
-              <w:spacing w:before="20" w:after="20"/>
-              <w:jc w:val="left"/>
-            </w:pPr>
-            <w:r>
-              <w:rPr>
-                <w:rFonts w:ascii="Calibri" w:hAnsi="Calibri"/>
-                <w:b w:val="0"/>
-                <w:i w:val="0"/>
-                <w:color w:val="000000"/>
-                <w:sz w:val="16"/>
-              </w:rPr>
-              <w:t>ø8-12 nervürlü</w:t>
-            </w:r>
-          </w:p>
-        </w:tc>
-        <w:tc>
-          <w:tcPr>
-            <w:tcW w:type="dxa" w:w="1234"/>
-            <w:tcBorders>
-              <w:top w:val="single" w:sz="4" w:space="0" w:color="808080"/>
-              <w:left w:val="single" w:sz="4" w:space="0" w:color="808080"/>
-              <w:bottom w:val="single" w:sz="4" w:space="0" w:color="808080"/>
-              <w:right w:val="single" w:sz="4" w:space="0" w:color="808080"/>
-            </w:tcBorders>
-          </w:tcPr>
-          <w:p>
-            <w:pPr>
-              <w:spacing w:before="20" w:after="20"/>
-              <w:jc w:val="left"/>
-            </w:pPr>
-            <w:r>
-              <w:rPr>
-                <w:rFonts w:ascii="Calibri" w:hAnsi="Calibri"/>
-                <w:b w:val="0"/>
-                <w:i w:val="0"/>
-                <w:color w:val="000000"/>
-                <w:sz w:val="16"/>
-              </w:rPr>
-              <w:t>0,256600</w:t>
-            </w:r>
-          </w:p>
-        </w:tc>
-        <w:tc>
-          <w:tcPr>
-            <w:tcW w:type="dxa" w:w="1234"/>
-            <w:tcBorders>
-              <w:top w:val="single" w:sz="4" w:space="0" w:color="808080"/>
-              <w:left w:val="single" w:sz="4" w:space="0" w:color="808080"/>
-              <w:bottom w:val="single" w:sz="4" w:space="0" w:color="808080"/>
-              <w:right w:val="single" w:sz="4" w:space="0" w:color="808080"/>
-            </w:tcBorders>
-          </w:tcPr>
-          <w:p>
-            <w:pPr>
-              <w:spacing w:before="20" w:after="20"/>
-              <w:jc w:val="left"/>
-            </w:pPr>
-            <w:r>
-              <w:rPr>
-                <w:rFonts w:ascii="Calibri" w:hAnsi="Calibri"/>
-                <w:b w:val="0"/>
-                <w:i w:val="0"/>
-                <w:color w:val="000000"/>
-                <w:sz w:val="16"/>
-              </w:rPr>
-              <w:t>0,256600</w:t>
-            </w:r>
-          </w:p>
-        </w:tc>
-      </w:tr>
-      <w:tr>
-        <w:tc>
-          <w:tcPr>
-            <w:tcW w:type="dxa" w:w="1178"/>
-            <w:tcBorders>
-              <w:top w:val="single" w:sz="4" w:space="0" w:color="808080"/>
-              <w:left w:val="single" w:sz="4" w:space="0" w:color="808080"/>
-              <w:bottom w:val="single" w:sz="4" w:space="0" w:color="808080"/>
-              <w:right w:val="single" w:sz="4" w:space="0" w:color="808080"/>
-            </w:tcBorders>
-          </w:tcPr>
-          <w:p>
-            <w:pPr>
-              <w:spacing w:before="20" w:after="20"/>
-              <w:jc w:val="left"/>
-            </w:pPr>
-          </w:p>
-        </w:tc>
-        <w:tc>
-          <w:tcPr>
-            <w:tcW w:type="dxa" w:w="1346"/>
-            <w:tcBorders>
-              <w:top w:val="single" w:sz="4" w:space="0" w:color="808080"/>
-              <w:left w:val="single" w:sz="4" w:space="0" w:color="808080"/>
-              <w:bottom w:val="single" w:sz="4" w:space="0" w:color="808080"/>
-              <w:right w:val="single" w:sz="4" w:space="0" w:color="808080"/>
-            </w:tcBorders>
-          </w:tcPr>
-          <w:p>
-            <w:pPr>
-              <w:spacing w:before="20" w:after="20"/>
-              <w:jc w:val="left"/>
-            </w:pPr>
-            <w:r>
-              <w:rPr>
-                <w:rFonts w:ascii="Calibri" w:hAnsi="Calibri"/>
-                <w:b w:val="0"/>
-                <w:i w:val="0"/>
-                <w:color w:val="000000"/>
-                <w:sz w:val="16"/>
-              </w:rPr>
-              <w:t>Perdeler 13,00 x 0,25 x 3,00 m³; 100 kg/m³</w:t>
-            </w:r>
-          </w:p>
-        </w:tc>
-        <w:tc>
-          <w:tcPr>
-            <w:tcW w:type="dxa" w:w="617"/>
-            <w:tcBorders>
-              <w:top w:val="single" w:sz="4" w:space="0" w:color="808080"/>
-              <w:left w:val="single" w:sz="4" w:space="0" w:color="808080"/>
-              <w:bottom w:val="single" w:sz="4" w:space="0" w:color="808080"/>
-              <w:right w:val="single" w:sz="4" w:space="0" w:color="808080"/>
-            </w:tcBorders>
-          </w:tcPr>
-          <w:p>
-            <w:pPr>
-              <w:spacing w:before="20" w:after="20"/>
-              <w:jc w:val="left"/>
-            </w:pPr>
-          </w:p>
-        </w:tc>
-        <w:tc>
-          <w:tcPr>
-            <w:tcW w:type="dxa" w:w="785"/>
-            <w:tcBorders>
-              <w:top w:val="single" w:sz="4" w:space="0" w:color="808080"/>
-              <w:left w:val="single" w:sz="4" w:space="0" w:color="808080"/>
-              <w:bottom w:val="single" w:sz="4" w:space="0" w:color="808080"/>
-              <w:right w:val="single" w:sz="4" w:space="0" w:color="808080"/>
-            </w:tcBorders>
-          </w:tcPr>
-          <w:p>
-            <w:pPr>
-              <w:spacing w:before="20" w:after="20"/>
-              <w:jc w:val="left"/>
-            </w:pPr>
-            <w:r>
-              <w:rPr>
-                <w:rFonts w:ascii="Calibri" w:hAnsi="Calibri"/>
-                <w:b w:val="0"/>
-                <w:i w:val="0"/>
-                <w:color w:val="000000"/>
-                <w:sz w:val="16"/>
-              </w:rPr>
-              <w:t>1</w:t>
-            </w:r>
-          </w:p>
-        </w:tc>
-        <w:tc>
-          <w:tcPr>
-            <w:tcW w:type="dxa" w:w="785"/>
-            <w:tcBorders>
-              <w:top w:val="single" w:sz="4" w:space="0" w:color="808080"/>
-              <w:left w:val="single" w:sz="4" w:space="0" w:color="808080"/>
-              <w:bottom w:val="single" w:sz="4" w:space="0" w:color="808080"/>
-              <w:right w:val="single" w:sz="4" w:space="0" w:color="808080"/>
-            </w:tcBorders>
-          </w:tcPr>
-          <w:p>
-            <w:pPr>
-              <w:spacing w:before="20" w:after="20"/>
-              <w:jc w:val="left"/>
-            </w:pPr>
-            <w:r>
-              <w:rPr>
-                <w:rFonts w:ascii="Calibri" w:hAnsi="Calibri"/>
-                <w:b w:val="0"/>
-                <w:i w:val="0"/>
-                <w:color w:val="000000"/>
-                <w:sz w:val="16"/>
-              </w:rPr>
-              <w:t>1</w:t>
-            </w:r>
-          </w:p>
-        </w:tc>
-        <w:tc>
-          <w:tcPr>
-            <w:tcW w:type="dxa" w:w="785"/>
-            <w:tcBorders>
-              <w:top w:val="single" w:sz="4" w:space="0" w:color="808080"/>
-              <w:left w:val="single" w:sz="4" w:space="0" w:color="808080"/>
-              <w:bottom w:val="single" w:sz="4" w:space="0" w:color="808080"/>
-              <w:right w:val="single" w:sz="4" w:space="0" w:color="808080"/>
-            </w:tcBorders>
-          </w:tcPr>
-          <w:p>
-            <w:pPr>
-              <w:spacing w:before="20" w:after="20"/>
-              <w:jc w:val="left"/>
-            </w:pPr>
-            <w:r>
-              <w:rPr>
-                <w:rFonts w:ascii="Calibri" w:hAnsi="Calibri"/>
-                <w:b w:val="0"/>
-                <w:i w:val="0"/>
-                <w:color w:val="000000"/>
-                <w:sz w:val="16"/>
-              </w:rPr>
-              <w:t>3,250</w:t>
-            </w:r>
-          </w:p>
-        </w:tc>
-        <w:tc>
-          <w:tcPr>
-            <w:tcW w:type="dxa" w:w="785"/>
-            <w:tcBorders>
-              <w:top w:val="single" w:sz="4" w:space="0" w:color="808080"/>
-              <w:left w:val="single" w:sz="4" w:space="0" w:color="808080"/>
-              <w:bottom w:val="single" w:sz="4" w:space="0" w:color="808080"/>
-              <w:right w:val="single" w:sz="4" w:space="0" w:color="808080"/>
-            </w:tcBorders>
-          </w:tcPr>
-          <w:p>
-            <w:pPr>
-              <w:spacing w:before="20" w:after="20"/>
-              <w:jc w:val="left"/>
-            </w:pPr>
-            <w:r>
-              <w:rPr>
-                <w:rFonts w:ascii="Calibri" w:hAnsi="Calibri"/>
-                <w:b w:val="0"/>
-                <w:i w:val="0"/>
-                <w:color w:val="000000"/>
-                <w:sz w:val="16"/>
-              </w:rPr>
-              <w:t>3,000</w:t>
-            </w:r>
-          </w:p>
-        </w:tc>
-        <w:tc>
-          <w:tcPr>
-            <w:tcW w:type="dxa" w:w="1682"/>
-            <w:tcBorders>
-              <w:top w:val="single" w:sz="4" w:space="0" w:color="808080"/>
-              <w:left w:val="single" w:sz="4" w:space="0" w:color="808080"/>
-              <w:bottom w:val="single" w:sz="4" w:space="0" w:color="808080"/>
-              <w:right w:val="single" w:sz="4" w:space="0" w:color="808080"/>
-            </w:tcBorders>
-          </w:tcPr>
-          <w:p>
-            <w:pPr>
-              <w:spacing w:before="20" w:after="20"/>
-              <w:jc w:val="left"/>
-            </w:pPr>
-            <w:r>
-              <w:rPr>
-                <w:rFonts w:ascii="Calibri" w:hAnsi="Calibri"/>
-                <w:b w:val="0"/>
-                <w:i w:val="0"/>
-                <w:color w:val="000000"/>
-                <w:sz w:val="16"/>
-              </w:rPr>
-              <w:t>ø8-12 nervürlü</w:t>
-            </w:r>
-          </w:p>
-        </w:tc>
-        <w:tc>
-          <w:tcPr>
-            <w:tcW w:type="dxa" w:w="1234"/>
-            <w:tcBorders>
-              <w:top w:val="single" w:sz="4" w:space="0" w:color="808080"/>
-              <w:left w:val="single" w:sz="4" w:space="0" w:color="808080"/>
-              <w:bottom w:val="single" w:sz="4" w:space="0" w:color="808080"/>
-              <w:right w:val="single" w:sz="4" w:space="0" w:color="808080"/>
-            </w:tcBorders>
-          </w:tcPr>
-          <w:p>
-            <w:pPr>
-              <w:spacing w:before="20" w:after="20"/>
-              <w:jc w:val="left"/>
-            </w:pPr>
-            <w:r>
-              <w:rPr>
-                <w:rFonts w:ascii="Calibri" w:hAnsi="Calibri"/>
-                <w:b w:val="0"/>
-                <w:i w:val="0"/>
-                <w:color w:val="000000"/>
-                <w:sz w:val="16"/>
-              </w:rPr>
-              <w:t>0,100000</w:t>
-            </w:r>
-          </w:p>
-        </w:tc>
-        <w:tc>
-          <w:tcPr>
-            <w:tcW w:type="dxa" w:w="1234"/>
-            <w:tcBorders>
-              <w:top w:val="single" w:sz="4" w:space="0" w:color="808080"/>
-              <w:left w:val="single" w:sz="4" w:space="0" w:color="808080"/>
-              <w:bottom w:val="single" w:sz="4" w:space="0" w:color="808080"/>
-              <w:right w:val="single" w:sz="4" w:space="0" w:color="808080"/>
-            </w:tcBorders>
-          </w:tcPr>
-          <w:p>
-            <w:pPr>
-              <w:spacing w:before="20" w:after="20"/>
-              <w:jc w:val="left"/>
-            </w:pPr>
-            <w:r>
-              <w:rPr>
-                <w:rFonts w:ascii="Calibri" w:hAnsi="Calibri"/>
-                <w:b w:val="0"/>
-                <w:i w:val="0"/>
-                <w:color w:val="000000"/>
-                <w:sz w:val="16"/>
-              </w:rPr>
-              <w:t>0,975000</w:t>
-            </w:r>
-          </w:p>
-        </w:tc>
-      </w:tr>
-      <w:tr>
-        <w:tc>
-          <w:tcPr>
-            <w:tcW w:type="dxa" w:w="1178"/>
-            <w:tcBorders>
-              <w:top w:val="single" w:sz="4" w:space="0" w:color="808080"/>
-              <w:left w:val="single" w:sz="4" w:space="0" w:color="808080"/>
-              <w:bottom w:val="single" w:sz="4" w:space="0" w:color="808080"/>
-              <w:right w:val="single" w:sz="4" w:space="0" w:color="808080"/>
-            </w:tcBorders>
-          </w:tcPr>
-          <w:p>
-            <w:pPr>
-              <w:spacing w:before="20" w:after="20"/>
-              <w:jc w:val="left"/>
-            </w:pPr>
-          </w:p>
-        </w:tc>
-        <w:tc>
-          <w:tcPr>
-            <w:tcW w:type="dxa" w:w="1346"/>
-            <w:tcBorders>
-              <w:top w:val="single" w:sz="4" w:space="0" w:color="808080"/>
-              <w:left w:val="single" w:sz="4" w:space="0" w:color="808080"/>
-              <w:bottom w:val="single" w:sz="4" w:space="0" w:color="808080"/>
-              <w:right w:val="single" w:sz="4" w:space="0" w:color="808080"/>
-            </w:tcBorders>
-          </w:tcPr>
-          <w:p>
-            <w:pPr>
-              <w:spacing w:before="20" w:after="20"/>
-              <w:jc w:val="left"/>
-            </w:pPr>
-            <w:r>
-              <w:rPr>
-                <w:rFonts w:ascii="Calibri" w:hAnsi="Calibri"/>
-                <w:b/>
-                <w:i w:val="0"/>
-                <w:color w:val="000000"/>
-                <w:sz w:val="16"/>
-              </w:rPr>
-              <w:t>M26 GENEL TOPLAM</w:t>
-            </w:r>
-          </w:p>
-        </w:tc>
-        <w:tc>
-          <w:tcPr>
-            <w:tcW w:type="dxa" w:w="617"/>
-            <w:tcBorders>
-              <w:top w:val="single" w:sz="4" w:space="0" w:color="808080"/>
-              <w:left w:val="single" w:sz="4" w:space="0" w:color="808080"/>
-              <w:bottom w:val="single" w:sz="4" w:space="0" w:color="808080"/>
-              <w:right w:val="single" w:sz="4" w:space="0" w:color="808080"/>
-            </w:tcBorders>
-          </w:tcPr>
-          <w:p>
-            <w:pPr>
-              <w:spacing w:before="20" w:after="20"/>
-              <w:jc w:val="left"/>
-            </w:pPr>
-            <w:r>
-              <w:rPr>
-                <w:rFonts w:ascii="Calibri" w:hAnsi="Calibri"/>
-                <w:b w:val="0"/>
-                <w:i w:val="0"/>
-                <w:color w:val="000000"/>
-                <w:sz w:val="16"/>
-              </w:rPr>
-              <w:t>ton</w:t>
-            </w:r>
-          </w:p>
-        </w:tc>
-        <w:tc>
-          <w:tcPr>
-            <w:tcW w:type="dxa" w:w="785"/>
-            <w:tcBorders>
-              <w:top w:val="single" w:sz="4" w:space="0" w:color="808080"/>
-              <w:left w:val="single" w:sz="4" w:space="0" w:color="808080"/>
-              <w:bottom w:val="single" w:sz="4" w:space="0" w:color="808080"/>
-              <w:right w:val="single" w:sz="4" w:space="0" w:color="808080"/>
-            </w:tcBorders>
-          </w:tcPr>
-          <w:p>
-            <w:pPr>
-              <w:spacing w:before="20" w:after="20"/>
-              <w:jc w:val="left"/>
-            </w:pPr>
-          </w:p>
-        </w:tc>
-        <w:tc>
-          <w:tcPr>
-            <w:tcW w:type="dxa" w:w="785"/>
-            <w:tcBorders>
-              <w:top w:val="single" w:sz="4" w:space="0" w:color="808080"/>
-              <w:left w:val="single" w:sz="4" w:space="0" w:color="808080"/>
-              <w:bottom w:val="single" w:sz="4" w:space="0" w:color="808080"/>
-              <w:right w:val="single" w:sz="4" w:space="0" w:color="808080"/>
-            </w:tcBorders>
-          </w:tcPr>
-          <w:p>
-            <w:pPr>
-              <w:spacing w:before="20" w:after="20"/>
-              <w:jc w:val="left"/>
-            </w:pPr>
-          </w:p>
-        </w:tc>
-        <w:tc>
-          <w:tcPr>
-            <w:tcW w:type="dxa" w:w="785"/>
-            <w:tcBorders>
-              <w:top w:val="single" w:sz="4" w:space="0" w:color="808080"/>
-              <w:left w:val="single" w:sz="4" w:space="0" w:color="808080"/>
-              <w:bottom w:val="single" w:sz="4" w:space="0" w:color="808080"/>
-              <w:right w:val="single" w:sz="4" w:space="0" w:color="808080"/>
-            </w:tcBorders>
-          </w:tcPr>
-          <w:p>
-            <w:pPr>
-              <w:spacing w:before="20" w:after="20"/>
-              <w:jc w:val="left"/>
-            </w:pPr>
-          </w:p>
-        </w:tc>
-        <w:tc>
-          <w:tcPr>
-            <w:tcW w:type="dxa" w:w="785"/>
-            <w:tcBorders>
-              <w:top w:val="single" w:sz="4" w:space="0" w:color="808080"/>
-              <w:left w:val="single" w:sz="4" w:space="0" w:color="808080"/>
-              <w:bottom w:val="single" w:sz="4" w:space="0" w:color="808080"/>
-              <w:right w:val="single" w:sz="4" w:space="0" w:color="808080"/>
-            </w:tcBorders>
-          </w:tcPr>
-          <w:p>
-            <w:pPr>
-              <w:spacing w:before="20" w:after="20"/>
-              <w:jc w:val="left"/>
-            </w:pPr>
-          </w:p>
-        </w:tc>
-        <w:tc>
-          <w:tcPr>
-            <w:tcW w:type="dxa" w:w="1682"/>
-            <w:tcBorders>
-              <w:top w:val="single" w:sz="4" w:space="0" w:color="808080"/>
-              <w:left w:val="single" w:sz="4" w:space="0" w:color="808080"/>
-              <w:bottom w:val="single" w:sz="4" w:space="0" w:color="808080"/>
-              <w:right w:val="single" w:sz="4" w:space="0" w:color="808080"/>
-            </w:tcBorders>
-          </w:tcPr>
-          <w:p>
-            <w:pPr>
-              <w:spacing w:before="20" w:after="20"/>
-              <w:jc w:val="left"/>
-            </w:pPr>
-          </w:p>
-        </w:tc>
-        <w:tc>
-          <w:tcPr>
-            <w:tcW w:type="dxa" w:w="1234"/>
-            <w:tcBorders>
-              <w:top w:val="single" w:sz="4" w:space="0" w:color="808080"/>
-              <w:left w:val="single" w:sz="4" w:space="0" w:color="808080"/>
-              <w:bottom w:val="single" w:sz="4" w:space="0" w:color="808080"/>
-              <w:right w:val="single" w:sz="4" w:space="0" w:color="808080"/>
-            </w:tcBorders>
-          </w:tcPr>
-          <w:p>
-            <w:pPr>
-              <w:spacing w:before="20" w:after="20"/>
-              <w:jc w:val="left"/>
-            </w:pPr>
-          </w:p>
-        </w:tc>
-        <w:tc>
-          <w:tcPr>
-            <w:tcW w:type="dxa" w:w="1234"/>
-            <w:tcBorders>
-              <w:top w:val="single" w:sz="4" w:space="0" w:color="808080"/>
-              <w:left w:val="single" w:sz="4" w:space="0" w:color="808080"/>
-              <w:bottom w:val="single" w:sz="4" w:space="0" w:color="808080"/>
-              <w:right w:val="single" w:sz="4" w:space="0" w:color="808080"/>
-            </w:tcBorders>
-          </w:tcPr>
-          <w:p>
-            <w:pPr>
-              <w:spacing w:before="20" w:after="20"/>
-              <w:jc w:val="left"/>
-            </w:pPr>
-            <w:r>
-              <w:rPr>
-                <w:rFonts w:ascii="Calibri" w:hAnsi="Calibri"/>
-                <w:b w:val="0"/>
-                <w:i w:val="0"/>
-                <w:color w:val="000000"/>
-                <w:sz w:val="16"/>
-              </w:rPr>
-              <w:t>5,462225</w:t>
+            <w:r>
+              <w:rPr>
+                <w:rFonts w:ascii="Calibri" w:hAnsi="Calibri"/>
+                <w:b w:val="0"/>
+                <w:i w:val="0"/>
+                <w:color w:val="000000"/>
+                <w:sz w:val="16"/>
+              </w:rPr>
+              <w:t>4,875600</w:t>
             </w:r>
           </w:p>
         </w:tc>

</xml_diff>

<commit_message>
Yayın: yem silosu kaideleri onaylı statik projeye göre metrajlandı (SILO-KAIDE-PROJESI)
Radye 2,90x2,90x0,40 + SB01…SB04 kolonları 40/40x1,10. Metraj yenilendi,
proforma ve A3.4-EK 72.659,08 TL ile ekranla aynı kaldı.

Co-Authored-By: Claude Opus 5 <noreply@anthropic.com>
Claude-Session: https://claude.ai/code/session_01HJPp6bx7wepUX5p8fxGcjg
</commit_message>
<xml_diff>
--- a/belgeler/04_METRAJ_CETVELI_AGIRLIK.docx
+++ b/belgeler/04_METRAJ_CETVELI_AGIRLIK.docx
@@ -23990,7 +23990,7 @@
                 <w:color w:val="000000"/>
                 <w:sz w:val="16"/>
               </w:rPr>
-              <w:t>4,875600</w:t>
+              <w:t>4,661480</w:t>
             </w:r>
           </w:p>
         </w:tc>
@@ -24615,7 +24615,7 @@
                 <w:color w:val="000000"/>
                 <w:sz w:val="16"/>
               </w:rPr>
-              <w:t>Kaideler 2,90 x 2,90 x 0,50 m³, 2 adet; 90 kg/m³</w:t>
+              <w:t>Radye temel — proje METRAJ tablosu 198,80 kg/kaide; 2 kaide</w:t>
             </w:r>
           </w:p>
         </w:tc>
@@ -24705,16 +24705,6 @@
               <w:spacing w:before="20" w:after="20"/>
               <w:jc w:val="left"/>
             </w:pPr>
-            <w:r>
-              <w:rPr>
-                <w:rFonts w:ascii="Calibri" w:hAnsi="Calibri"/>
-                <w:b w:val="0"/>
-                <w:i w:val="0"/>
-                <w:color w:val="000000"/>
-                <w:sz w:val="16"/>
-              </w:rPr>
-              <w:t>8,410</w:t>
-            </w:r>
           </w:p>
         </w:tc>
         <w:tc>
@@ -24732,16 +24722,6 @@
               <w:spacing w:before="20" w:after="20"/>
               <w:jc w:val="left"/>
             </w:pPr>
-            <w:r>
-              <w:rPr>
-                <w:rFonts w:ascii="Calibri" w:hAnsi="Calibri"/>
-                <w:b w:val="0"/>
-                <w:i w:val="0"/>
-                <w:color w:val="000000"/>
-                <w:sz w:val="16"/>
-              </w:rPr>
-              <w:t>0,500</w:t>
-            </w:r>
           </w:p>
         </w:tc>
         <w:tc>
@@ -24794,7 +24774,7 @@
                 <w:color w:val="000000"/>
                 <w:sz w:val="16"/>
               </w:rPr>
-              <w:t>0,090000</w:t>
+              <w:t>0,198800</w:t>
             </w:r>
           </w:p>
         </w:tc>
@@ -24821,7 +24801,7 @@
                 <w:color w:val="000000"/>
                 <w:sz w:val="16"/>
               </w:rPr>
-              <w:t>0,756900</w:t>
+              <w:t>0,397600</w:t>
             </w:r>
           </w:p>
         </w:tc>
@@ -24862,6 +24842,238 @@
             <w:r>
               <w:rPr>
                 <w:rFonts w:ascii="Calibri" w:hAnsi="Calibri"/>
+                <w:b w:val="0"/>
+                <w:i w:val="0"/>
+                <w:color w:val="000000"/>
+                <w:sz w:val="16"/>
+              </w:rPr>
+              <w:t>SB01…SB04 kolonları — proje METRAJ tablosu 72,59 kg/kaide; 2 kaide</w:t>
+            </w:r>
+          </w:p>
+        </w:tc>
+        <w:tc>
+          <w:tcPr>
+            <w:tcW w:type="dxa" w:w="617"/>
+            <w:tcBorders>
+              <w:top w:val="single" w:sz="4" w:space="0" w:color="808080"/>
+              <w:left w:val="single" w:sz="4" w:space="0" w:color="808080"/>
+              <w:bottom w:val="single" w:sz="4" w:space="0" w:color="808080"/>
+              <w:right w:val="single" w:sz="4" w:space="0" w:color="808080"/>
+            </w:tcBorders>
+          </w:tcPr>
+          <w:p>
+            <w:pPr>
+              <w:spacing w:before="20" w:after="20"/>
+              <w:jc w:val="left"/>
+            </w:pPr>
+          </w:p>
+        </w:tc>
+        <w:tc>
+          <w:tcPr>
+            <w:tcW w:type="dxa" w:w="785"/>
+            <w:tcBorders>
+              <w:top w:val="single" w:sz="4" w:space="0" w:color="808080"/>
+              <w:left w:val="single" w:sz="4" w:space="0" w:color="808080"/>
+              <w:bottom w:val="single" w:sz="4" w:space="0" w:color="808080"/>
+              <w:right w:val="single" w:sz="4" w:space="0" w:color="808080"/>
+            </w:tcBorders>
+          </w:tcPr>
+          <w:p>
+            <w:pPr>
+              <w:spacing w:before="20" w:after="20"/>
+              <w:jc w:val="left"/>
+            </w:pPr>
+            <w:r>
+              <w:rPr>
+                <w:rFonts w:ascii="Calibri" w:hAnsi="Calibri"/>
+                <w:b w:val="0"/>
+                <w:i w:val="0"/>
+                <w:color w:val="000000"/>
+                <w:sz w:val="16"/>
+              </w:rPr>
+              <w:t>2</w:t>
+            </w:r>
+          </w:p>
+        </w:tc>
+        <w:tc>
+          <w:tcPr>
+            <w:tcW w:type="dxa" w:w="785"/>
+            <w:tcBorders>
+              <w:top w:val="single" w:sz="4" w:space="0" w:color="808080"/>
+              <w:left w:val="single" w:sz="4" w:space="0" w:color="808080"/>
+              <w:bottom w:val="single" w:sz="4" w:space="0" w:color="808080"/>
+              <w:right w:val="single" w:sz="4" w:space="0" w:color="808080"/>
+            </w:tcBorders>
+          </w:tcPr>
+          <w:p>
+            <w:pPr>
+              <w:spacing w:before="20" w:after="20"/>
+              <w:jc w:val="left"/>
+            </w:pPr>
+            <w:r>
+              <w:rPr>
+                <w:rFonts w:ascii="Calibri" w:hAnsi="Calibri"/>
+                <w:b w:val="0"/>
+                <w:i w:val="0"/>
+                <w:color w:val="000000"/>
+                <w:sz w:val="16"/>
+              </w:rPr>
+              <w:t>1</w:t>
+            </w:r>
+          </w:p>
+        </w:tc>
+        <w:tc>
+          <w:tcPr>
+            <w:tcW w:type="dxa" w:w="785"/>
+            <w:tcBorders>
+              <w:top w:val="single" w:sz="4" w:space="0" w:color="808080"/>
+              <w:left w:val="single" w:sz="4" w:space="0" w:color="808080"/>
+              <w:bottom w:val="single" w:sz="4" w:space="0" w:color="808080"/>
+              <w:right w:val="single" w:sz="4" w:space="0" w:color="808080"/>
+            </w:tcBorders>
+          </w:tcPr>
+          <w:p>
+            <w:pPr>
+              <w:spacing w:before="20" w:after="20"/>
+              <w:jc w:val="left"/>
+            </w:pPr>
+          </w:p>
+        </w:tc>
+        <w:tc>
+          <w:tcPr>
+            <w:tcW w:type="dxa" w:w="785"/>
+            <w:tcBorders>
+              <w:top w:val="single" w:sz="4" w:space="0" w:color="808080"/>
+              <w:left w:val="single" w:sz="4" w:space="0" w:color="808080"/>
+              <w:bottom w:val="single" w:sz="4" w:space="0" w:color="808080"/>
+              <w:right w:val="single" w:sz="4" w:space="0" w:color="808080"/>
+            </w:tcBorders>
+          </w:tcPr>
+          <w:p>
+            <w:pPr>
+              <w:spacing w:before="20" w:after="20"/>
+              <w:jc w:val="left"/>
+            </w:pPr>
+          </w:p>
+        </w:tc>
+        <w:tc>
+          <w:tcPr>
+            <w:tcW w:type="dxa" w:w="1682"/>
+            <w:tcBorders>
+              <w:top w:val="single" w:sz="4" w:space="0" w:color="808080"/>
+              <w:left w:val="single" w:sz="4" w:space="0" w:color="808080"/>
+              <w:bottom w:val="single" w:sz="4" w:space="0" w:color="808080"/>
+              <w:right w:val="single" w:sz="4" w:space="0" w:color="808080"/>
+            </w:tcBorders>
+          </w:tcPr>
+          <w:p>
+            <w:pPr>
+              <w:spacing w:before="20" w:after="20"/>
+              <w:jc w:val="left"/>
+            </w:pPr>
+            <w:r>
+              <w:rPr>
+                <w:rFonts w:ascii="Calibri" w:hAnsi="Calibri"/>
+                <w:b w:val="0"/>
+                <w:i w:val="0"/>
+                <w:color w:val="000000"/>
+                <w:sz w:val="16"/>
+              </w:rPr>
+              <w:t>ø8-12 nervürlü</w:t>
+            </w:r>
+          </w:p>
+        </w:tc>
+        <w:tc>
+          <w:tcPr>
+            <w:tcW w:type="dxa" w:w="1234"/>
+            <w:tcBorders>
+              <w:top w:val="single" w:sz="4" w:space="0" w:color="808080"/>
+              <w:left w:val="single" w:sz="4" w:space="0" w:color="808080"/>
+              <w:bottom w:val="single" w:sz="4" w:space="0" w:color="808080"/>
+              <w:right w:val="single" w:sz="4" w:space="0" w:color="808080"/>
+            </w:tcBorders>
+          </w:tcPr>
+          <w:p>
+            <w:pPr>
+              <w:spacing w:before="20" w:after="20"/>
+              <w:jc w:val="left"/>
+            </w:pPr>
+            <w:r>
+              <w:rPr>
+                <w:rFonts w:ascii="Calibri" w:hAnsi="Calibri"/>
+                <w:b w:val="0"/>
+                <w:i w:val="0"/>
+                <w:color w:val="000000"/>
+                <w:sz w:val="16"/>
+              </w:rPr>
+              <w:t>0,072590</w:t>
+            </w:r>
+          </w:p>
+        </w:tc>
+        <w:tc>
+          <w:tcPr>
+            <w:tcW w:type="dxa" w:w="1234"/>
+            <w:tcBorders>
+              <w:top w:val="single" w:sz="4" w:space="0" w:color="808080"/>
+              <w:left w:val="single" w:sz="4" w:space="0" w:color="808080"/>
+              <w:bottom w:val="single" w:sz="4" w:space="0" w:color="808080"/>
+              <w:right w:val="single" w:sz="4" w:space="0" w:color="808080"/>
+            </w:tcBorders>
+          </w:tcPr>
+          <w:p>
+            <w:pPr>
+              <w:spacing w:before="20" w:after="20"/>
+              <w:jc w:val="left"/>
+            </w:pPr>
+            <w:r>
+              <w:rPr>
+                <w:rFonts w:ascii="Calibri" w:hAnsi="Calibri"/>
+                <w:b w:val="0"/>
+                <w:i w:val="0"/>
+                <w:color w:val="000000"/>
+                <w:sz w:val="16"/>
+              </w:rPr>
+              <w:t>0,145180</w:t>
+            </w:r>
+          </w:p>
+        </w:tc>
+      </w:tr>
+      <w:tr>
+        <w:tc>
+          <w:tcPr>
+            <w:tcW w:type="dxa" w:w="1178"/>
+            <w:tcBorders>
+              <w:top w:val="single" w:sz="4" w:space="0" w:color="808080"/>
+              <w:left w:val="single" w:sz="4" w:space="0" w:color="808080"/>
+              <w:bottom w:val="single" w:sz="4" w:space="0" w:color="808080"/>
+              <w:right w:val="single" w:sz="4" w:space="0" w:color="808080"/>
+            </w:tcBorders>
+          </w:tcPr>
+          <w:p>
+            <w:pPr>
+              <w:spacing w:before="20" w:after="20"/>
+              <w:jc w:val="left"/>
+            </w:pPr>
+          </w:p>
+        </w:tc>
+        <w:tc>
+          <w:tcPr>
+            <w:tcW w:type="dxa" w:w="1346"/>
+            <w:tcBorders>
+              <w:top w:val="single" w:sz="4" w:space="0" w:color="808080"/>
+              <w:left w:val="single" w:sz="4" w:space="0" w:color="808080"/>
+              <w:bottom w:val="single" w:sz="4" w:space="0" w:color="808080"/>
+              <w:right w:val="single" w:sz="4" w:space="0" w:color="808080"/>
+            </w:tcBorders>
+          </w:tcPr>
+          <w:p>
+            <w:pPr>
+              <w:spacing w:before="20" w:after="20"/>
+              <w:jc w:val="left"/>
+            </w:pPr>
+            <w:r>
+              <w:rPr>
+                <w:rFonts w:ascii="Calibri" w:hAnsi="Calibri"/>
                 <w:b/>
                 <w:i w:val="0"/>
                 <w:color w:val="000000"/>
@@ -25023,7 +25235,875 @@
                 <w:color w:val="000000"/>
                 <w:sz w:val="16"/>
               </w:rPr>
-              <w:t>4,875600</w:t>
+              <w:t>4,661480</w:t>
+            </w:r>
+          </w:p>
+        </w:tc>
+      </w:tr>
+      <w:tr>
+        <w:tc>
+          <w:tcPr>
+            <w:tcW w:type="dxa" w:w="1178"/>
+            <w:tcBorders>
+              <w:top w:val="single" w:sz="4" w:space="0" w:color="808080"/>
+              <w:left w:val="single" w:sz="4" w:space="0" w:color="808080"/>
+              <w:bottom w:val="single" w:sz="4" w:space="0" w:color="808080"/>
+              <w:right w:val="single" w:sz="4" w:space="0" w:color="808080"/>
+            </w:tcBorders>
+          </w:tcPr>
+          <w:p>
+            <w:pPr>
+              <w:spacing w:before="20" w:after="20"/>
+              <w:jc w:val="left"/>
+            </w:pPr>
+            <w:r>
+              <w:rPr>
+                <w:rFonts w:ascii="Calibri" w:hAnsi="Calibri"/>
+                <w:b w:val="0"/>
+                <w:i w:val="0"/>
+                <w:color w:val="000000"/>
+                <w:sz w:val="16"/>
+              </w:rPr>
+              <w:t>15.160.1004</w:t>
+            </w:r>
+          </w:p>
+        </w:tc>
+        <w:tc>
+          <w:tcPr>
+            <w:tcW w:type="dxa" w:w="1346"/>
+            <w:tcBorders>
+              <w:top w:val="single" w:sz="4" w:space="0" w:color="808080"/>
+              <w:left w:val="single" w:sz="4" w:space="0" w:color="808080"/>
+              <w:bottom w:val="single" w:sz="4" w:space="0" w:color="808080"/>
+              <w:right w:val="single" w:sz="4" w:space="0" w:color="808080"/>
+            </w:tcBorders>
+          </w:tcPr>
+          <w:p>
+            <w:pPr>
+              <w:spacing w:before="20" w:after="20"/>
+              <w:jc w:val="left"/>
+            </w:pPr>
+            <w:r>
+              <w:rPr>
+                <w:rFonts w:ascii="Calibri" w:hAnsi="Calibri"/>
+                <w:b/>
+                <w:i w:val="0"/>
+                <w:color w:val="000000"/>
+                <w:sz w:val="16"/>
+              </w:rPr>
+              <w:t>[M28]  Ø 14 - Ø 28 mm nervürlü beton çelik çubuğu, çubukların kesilmesi, bükülmesi ve yerine konulması</w:t>
+            </w:r>
+          </w:p>
+        </w:tc>
+        <w:tc>
+          <w:tcPr>
+            <w:tcW w:type="dxa" w:w="617"/>
+            <w:tcBorders>
+              <w:top w:val="single" w:sz="4" w:space="0" w:color="808080"/>
+              <w:left w:val="single" w:sz="4" w:space="0" w:color="808080"/>
+              <w:bottom w:val="single" w:sz="4" w:space="0" w:color="808080"/>
+              <w:right w:val="single" w:sz="4" w:space="0" w:color="808080"/>
+            </w:tcBorders>
+          </w:tcPr>
+          <w:p>
+            <w:pPr>
+              <w:spacing w:before="20" w:after="20"/>
+              <w:jc w:val="left"/>
+            </w:pPr>
+            <w:r>
+              <w:rPr>
+                <w:rFonts w:ascii="Calibri" w:hAnsi="Calibri"/>
+                <w:b w:val="0"/>
+                <w:i w:val="0"/>
+                <w:color w:val="000000"/>
+                <w:sz w:val="16"/>
+              </w:rPr>
+              <w:t>ton</w:t>
+            </w:r>
+          </w:p>
+        </w:tc>
+        <w:tc>
+          <w:tcPr>
+            <w:tcW w:type="dxa" w:w="785"/>
+            <w:tcBorders>
+              <w:top w:val="single" w:sz="4" w:space="0" w:color="808080"/>
+              <w:left w:val="single" w:sz="4" w:space="0" w:color="808080"/>
+              <w:bottom w:val="single" w:sz="4" w:space="0" w:color="808080"/>
+              <w:right w:val="single" w:sz="4" w:space="0" w:color="808080"/>
+            </w:tcBorders>
+          </w:tcPr>
+          <w:p>
+            <w:pPr>
+              <w:spacing w:before="20" w:after="20"/>
+              <w:jc w:val="left"/>
+            </w:pPr>
+          </w:p>
+        </w:tc>
+        <w:tc>
+          <w:tcPr>
+            <w:tcW w:type="dxa" w:w="785"/>
+            <w:tcBorders>
+              <w:top w:val="single" w:sz="4" w:space="0" w:color="808080"/>
+              <w:left w:val="single" w:sz="4" w:space="0" w:color="808080"/>
+              <w:bottom w:val="single" w:sz="4" w:space="0" w:color="808080"/>
+              <w:right w:val="single" w:sz="4" w:space="0" w:color="808080"/>
+            </w:tcBorders>
+          </w:tcPr>
+          <w:p>
+            <w:pPr>
+              <w:spacing w:before="20" w:after="20"/>
+              <w:jc w:val="left"/>
+            </w:pPr>
+          </w:p>
+        </w:tc>
+        <w:tc>
+          <w:tcPr>
+            <w:tcW w:type="dxa" w:w="785"/>
+            <w:tcBorders>
+              <w:top w:val="single" w:sz="4" w:space="0" w:color="808080"/>
+              <w:left w:val="single" w:sz="4" w:space="0" w:color="808080"/>
+              <w:bottom w:val="single" w:sz="4" w:space="0" w:color="808080"/>
+              <w:right w:val="single" w:sz="4" w:space="0" w:color="808080"/>
+            </w:tcBorders>
+          </w:tcPr>
+          <w:p>
+            <w:pPr>
+              <w:spacing w:before="20" w:after="20"/>
+              <w:jc w:val="left"/>
+            </w:pPr>
+          </w:p>
+        </w:tc>
+        <w:tc>
+          <w:tcPr>
+            <w:tcW w:type="dxa" w:w="785"/>
+            <w:tcBorders>
+              <w:top w:val="single" w:sz="4" w:space="0" w:color="808080"/>
+              <w:left w:val="single" w:sz="4" w:space="0" w:color="808080"/>
+              <w:bottom w:val="single" w:sz="4" w:space="0" w:color="808080"/>
+              <w:right w:val="single" w:sz="4" w:space="0" w:color="808080"/>
+            </w:tcBorders>
+          </w:tcPr>
+          <w:p>
+            <w:pPr>
+              <w:spacing w:before="20" w:after="20"/>
+              <w:jc w:val="left"/>
+            </w:pPr>
+          </w:p>
+        </w:tc>
+        <w:tc>
+          <w:tcPr>
+            <w:tcW w:type="dxa" w:w="1682"/>
+            <w:tcBorders>
+              <w:top w:val="single" w:sz="4" w:space="0" w:color="808080"/>
+              <w:left w:val="single" w:sz="4" w:space="0" w:color="808080"/>
+              <w:bottom w:val="single" w:sz="4" w:space="0" w:color="808080"/>
+              <w:right w:val="single" w:sz="4" w:space="0" w:color="808080"/>
+            </w:tcBorders>
+          </w:tcPr>
+          <w:p>
+            <w:pPr>
+              <w:spacing w:before="20" w:after="20"/>
+              <w:jc w:val="left"/>
+            </w:pPr>
+          </w:p>
+        </w:tc>
+        <w:tc>
+          <w:tcPr>
+            <w:tcW w:type="dxa" w:w="1234"/>
+            <w:tcBorders>
+              <w:top w:val="single" w:sz="4" w:space="0" w:color="808080"/>
+              <w:left w:val="single" w:sz="4" w:space="0" w:color="808080"/>
+              <w:bottom w:val="single" w:sz="4" w:space="0" w:color="808080"/>
+              <w:right w:val="single" w:sz="4" w:space="0" w:color="808080"/>
+            </w:tcBorders>
+          </w:tcPr>
+          <w:p>
+            <w:pPr>
+              <w:spacing w:before="20" w:after="20"/>
+              <w:jc w:val="left"/>
+            </w:pPr>
+          </w:p>
+        </w:tc>
+        <w:tc>
+          <w:tcPr>
+            <w:tcW w:type="dxa" w:w="1234"/>
+            <w:tcBorders>
+              <w:top w:val="single" w:sz="4" w:space="0" w:color="808080"/>
+              <w:left w:val="single" w:sz="4" w:space="0" w:color="808080"/>
+              <w:bottom w:val="single" w:sz="4" w:space="0" w:color="808080"/>
+              <w:right w:val="single" w:sz="4" w:space="0" w:color="808080"/>
+            </w:tcBorders>
+          </w:tcPr>
+          <w:p>
+            <w:pPr>
+              <w:spacing w:before="20" w:after="20"/>
+              <w:jc w:val="left"/>
+            </w:pPr>
+          </w:p>
+        </w:tc>
+      </w:tr>
+      <w:tr>
+        <w:tc>
+          <w:tcPr>
+            <w:tcW w:type="dxa" w:w="1178"/>
+            <w:tcBorders>
+              <w:top w:val="single" w:sz="4" w:space="0" w:color="808080"/>
+              <w:left w:val="single" w:sz="4" w:space="0" w:color="808080"/>
+              <w:bottom w:val="single" w:sz="4" w:space="0" w:color="808080"/>
+              <w:right w:val="single" w:sz="4" w:space="0" w:color="808080"/>
+            </w:tcBorders>
+          </w:tcPr>
+          <w:p>
+            <w:pPr>
+              <w:spacing w:before="20" w:after="20"/>
+              <w:jc w:val="left"/>
+            </w:pPr>
+          </w:p>
+        </w:tc>
+        <w:tc>
+          <w:tcPr>
+            <w:tcW w:type="dxa" w:w="1346"/>
+            <w:tcBorders>
+              <w:top w:val="single" w:sz="4" w:space="0" w:color="808080"/>
+              <w:left w:val="single" w:sz="4" w:space="0" w:color="808080"/>
+              <w:bottom w:val="single" w:sz="4" w:space="0" w:color="808080"/>
+              <w:right w:val="single" w:sz="4" w:space="0" w:color="808080"/>
+            </w:tcBorders>
+          </w:tcPr>
+          <w:p>
+            <w:pPr>
+              <w:spacing w:before="20" w:after="20"/>
+              <w:jc w:val="left"/>
+            </w:pPr>
+            <w:r>
+              <w:rPr>
+                <w:rFonts w:ascii="Calibri" w:hAnsi="Calibri"/>
+                <w:b w:val="0"/>
+                <w:i w:val="0"/>
+                <w:color w:val="000000"/>
+                <w:sz w:val="16"/>
+              </w:rPr>
+              <w:t>Radye kolon filizleri P07 48ø14 l=160 — proje METRAJ tablosu 92,70 kg/kaide; 2 kaide</w:t>
+            </w:r>
+          </w:p>
+        </w:tc>
+        <w:tc>
+          <w:tcPr>
+            <w:tcW w:type="dxa" w:w="617"/>
+            <w:tcBorders>
+              <w:top w:val="single" w:sz="4" w:space="0" w:color="808080"/>
+              <w:left w:val="single" w:sz="4" w:space="0" w:color="808080"/>
+              <w:bottom w:val="single" w:sz="4" w:space="0" w:color="808080"/>
+              <w:right w:val="single" w:sz="4" w:space="0" w:color="808080"/>
+            </w:tcBorders>
+          </w:tcPr>
+          <w:p>
+            <w:pPr>
+              <w:spacing w:before="20" w:after="20"/>
+              <w:jc w:val="left"/>
+            </w:pPr>
+          </w:p>
+        </w:tc>
+        <w:tc>
+          <w:tcPr>
+            <w:tcW w:type="dxa" w:w="785"/>
+            <w:tcBorders>
+              <w:top w:val="single" w:sz="4" w:space="0" w:color="808080"/>
+              <w:left w:val="single" w:sz="4" w:space="0" w:color="808080"/>
+              <w:bottom w:val="single" w:sz="4" w:space="0" w:color="808080"/>
+              <w:right w:val="single" w:sz="4" w:space="0" w:color="808080"/>
+            </w:tcBorders>
+          </w:tcPr>
+          <w:p>
+            <w:pPr>
+              <w:spacing w:before="20" w:after="20"/>
+              <w:jc w:val="left"/>
+            </w:pPr>
+            <w:r>
+              <w:rPr>
+                <w:rFonts w:ascii="Calibri" w:hAnsi="Calibri"/>
+                <w:b w:val="0"/>
+                <w:i w:val="0"/>
+                <w:color w:val="000000"/>
+                <w:sz w:val="16"/>
+              </w:rPr>
+              <w:t>2</w:t>
+            </w:r>
+          </w:p>
+        </w:tc>
+        <w:tc>
+          <w:tcPr>
+            <w:tcW w:type="dxa" w:w="785"/>
+            <w:tcBorders>
+              <w:top w:val="single" w:sz="4" w:space="0" w:color="808080"/>
+              <w:left w:val="single" w:sz="4" w:space="0" w:color="808080"/>
+              <w:bottom w:val="single" w:sz="4" w:space="0" w:color="808080"/>
+              <w:right w:val="single" w:sz="4" w:space="0" w:color="808080"/>
+            </w:tcBorders>
+          </w:tcPr>
+          <w:p>
+            <w:pPr>
+              <w:spacing w:before="20" w:after="20"/>
+              <w:jc w:val="left"/>
+            </w:pPr>
+            <w:r>
+              <w:rPr>
+                <w:rFonts w:ascii="Calibri" w:hAnsi="Calibri"/>
+                <w:b w:val="0"/>
+                <w:i w:val="0"/>
+                <w:color w:val="000000"/>
+                <w:sz w:val="16"/>
+              </w:rPr>
+              <w:t>1</w:t>
+            </w:r>
+          </w:p>
+        </w:tc>
+        <w:tc>
+          <w:tcPr>
+            <w:tcW w:type="dxa" w:w="785"/>
+            <w:tcBorders>
+              <w:top w:val="single" w:sz="4" w:space="0" w:color="808080"/>
+              <w:left w:val="single" w:sz="4" w:space="0" w:color="808080"/>
+              <w:bottom w:val="single" w:sz="4" w:space="0" w:color="808080"/>
+              <w:right w:val="single" w:sz="4" w:space="0" w:color="808080"/>
+            </w:tcBorders>
+          </w:tcPr>
+          <w:p>
+            <w:pPr>
+              <w:spacing w:before="20" w:after="20"/>
+              <w:jc w:val="left"/>
+            </w:pPr>
+          </w:p>
+        </w:tc>
+        <w:tc>
+          <w:tcPr>
+            <w:tcW w:type="dxa" w:w="785"/>
+            <w:tcBorders>
+              <w:top w:val="single" w:sz="4" w:space="0" w:color="808080"/>
+              <w:left w:val="single" w:sz="4" w:space="0" w:color="808080"/>
+              <w:bottom w:val="single" w:sz="4" w:space="0" w:color="808080"/>
+              <w:right w:val="single" w:sz="4" w:space="0" w:color="808080"/>
+            </w:tcBorders>
+          </w:tcPr>
+          <w:p>
+            <w:pPr>
+              <w:spacing w:before="20" w:after="20"/>
+              <w:jc w:val="left"/>
+            </w:pPr>
+          </w:p>
+        </w:tc>
+        <w:tc>
+          <w:tcPr>
+            <w:tcW w:type="dxa" w:w="1682"/>
+            <w:tcBorders>
+              <w:top w:val="single" w:sz="4" w:space="0" w:color="808080"/>
+              <w:left w:val="single" w:sz="4" w:space="0" w:color="808080"/>
+              <w:bottom w:val="single" w:sz="4" w:space="0" w:color="808080"/>
+              <w:right w:val="single" w:sz="4" w:space="0" w:color="808080"/>
+            </w:tcBorders>
+          </w:tcPr>
+          <w:p>
+            <w:pPr>
+              <w:spacing w:before="20" w:after="20"/>
+              <w:jc w:val="left"/>
+            </w:pPr>
+            <w:r>
+              <w:rPr>
+                <w:rFonts w:ascii="Calibri" w:hAnsi="Calibri"/>
+                <w:b w:val="0"/>
+                <w:i w:val="0"/>
+                <w:color w:val="000000"/>
+                <w:sz w:val="16"/>
+              </w:rPr>
+              <w:t>ø14 nervürlü</w:t>
+            </w:r>
+          </w:p>
+        </w:tc>
+        <w:tc>
+          <w:tcPr>
+            <w:tcW w:type="dxa" w:w="1234"/>
+            <w:tcBorders>
+              <w:top w:val="single" w:sz="4" w:space="0" w:color="808080"/>
+              <w:left w:val="single" w:sz="4" w:space="0" w:color="808080"/>
+              <w:bottom w:val="single" w:sz="4" w:space="0" w:color="808080"/>
+              <w:right w:val="single" w:sz="4" w:space="0" w:color="808080"/>
+            </w:tcBorders>
+          </w:tcPr>
+          <w:p>
+            <w:pPr>
+              <w:spacing w:before="20" w:after="20"/>
+              <w:jc w:val="left"/>
+            </w:pPr>
+            <w:r>
+              <w:rPr>
+                <w:rFonts w:ascii="Calibri" w:hAnsi="Calibri"/>
+                <w:b w:val="0"/>
+                <w:i w:val="0"/>
+                <w:color w:val="000000"/>
+                <w:sz w:val="16"/>
+              </w:rPr>
+              <w:t>0,092700</w:t>
+            </w:r>
+          </w:p>
+        </w:tc>
+        <w:tc>
+          <w:tcPr>
+            <w:tcW w:type="dxa" w:w="1234"/>
+            <w:tcBorders>
+              <w:top w:val="single" w:sz="4" w:space="0" w:color="808080"/>
+              <w:left w:val="single" w:sz="4" w:space="0" w:color="808080"/>
+              <w:bottom w:val="single" w:sz="4" w:space="0" w:color="808080"/>
+              <w:right w:val="single" w:sz="4" w:space="0" w:color="808080"/>
+            </w:tcBorders>
+          </w:tcPr>
+          <w:p>
+            <w:pPr>
+              <w:spacing w:before="20" w:after="20"/>
+              <w:jc w:val="left"/>
+            </w:pPr>
+            <w:r>
+              <w:rPr>
+                <w:rFonts w:ascii="Calibri" w:hAnsi="Calibri"/>
+                <w:b w:val="0"/>
+                <w:i w:val="0"/>
+                <w:color w:val="000000"/>
+                <w:sz w:val="16"/>
+              </w:rPr>
+              <w:t>0,185400</w:t>
+            </w:r>
+          </w:p>
+        </w:tc>
+      </w:tr>
+      <w:tr>
+        <w:tc>
+          <w:tcPr>
+            <w:tcW w:type="dxa" w:w="1178"/>
+            <w:tcBorders>
+              <w:top w:val="single" w:sz="4" w:space="0" w:color="808080"/>
+              <w:left w:val="single" w:sz="4" w:space="0" w:color="808080"/>
+              <w:bottom w:val="single" w:sz="4" w:space="0" w:color="808080"/>
+              <w:right w:val="single" w:sz="4" w:space="0" w:color="808080"/>
+            </w:tcBorders>
+          </w:tcPr>
+          <w:p>
+            <w:pPr>
+              <w:spacing w:before="20" w:after="20"/>
+              <w:jc w:val="left"/>
+            </w:pPr>
+          </w:p>
+        </w:tc>
+        <w:tc>
+          <w:tcPr>
+            <w:tcW w:type="dxa" w:w="1346"/>
+            <w:tcBorders>
+              <w:top w:val="single" w:sz="4" w:space="0" w:color="808080"/>
+              <w:left w:val="single" w:sz="4" w:space="0" w:color="808080"/>
+              <w:bottom w:val="single" w:sz="4" w:space="0" w:color="808080"/>
+              <w:right w:val="single" w:sz="4" w:space="0" w:color="808080"/>
+            </w:tcBorders>
+          </w:tcPr>
+          <w:p>
+            <w:pPr>
+              <w:spacing w:before="20" w:after="20"/>
+              <w:jc w:val="left"/>
+            </w:pPr>
+            <w:r>
+              <w:rPr>
+                <w:rFonts w:ascii="Calibri" w:hAnsi="Calibri"/>
+                <w:b w:val="0"/>
+                <w:i w:val="0"/>
+                <w:color w:val="000000"/>
+                <w:sz w:val="16"/>
+              </w:rPr>
+              <w:t>SB01…SB04 kolon boyuna donatısı 12ø14 — proje METRAJ tablosu 85,70 kg/kaide; 2 kaide</w:t>
+            </w:r>
+          </w:p>
+        </w:tc>
+        <w:tc>
+          <w:tcPr>
+            <w:tcW w:type="dxa" w:w="617"/>
+            <w:tcBorders>
+              <w:top w:val="single" w:sz="4" w:space="0" w:color="808080"/>
+              <w:left w:val="single" w:sz="4" w:space="0" w:color="808080"/>
+              <w:bottom w:val="single" w:sz="4" w:space="0" w:color="808080"/>
+              <w:right w:val="single" w:sz="4" w:space="0" w:color="808080"/>
+            </w:tcBorders>
+          </w:tcPr>
+          <w:p>
+            <w:pPr>
+              <w:spacing w:before="20" w:after="20"/>
+              <w:jc w:val="left"/>
+            </w:pPr>
+          </w:p>
+        </w:tc>
+        <w:tc>
+          <w:tcPr>
+            <w:tcW w:type="dxa" w:w="785"/>
+            <w:tcBorders>
+              <w:top w:val="single" w:sz="4" w:space="0" w:color="808080"/>
+              <w:left w:val="single" w:sz="4" w:space="0" w:color="808080"/>
+              <w:bottom w:val="single" w:sz="4" w:space="0" w:color="808080"/>
+              <w:right w:val="single" w:sz="4" w:space="0" w:color="808080"/>
+            </w:tcBorders>
+          </w:tcPr>
+          <w:p>
+            <w:pPr>
+              <w:spacing w:before="20" w:after="20"/>
+              <w:jc w:val="left"/>
+            </w:pPr>
+            <w:r>
+              <w:rPr>
+                <w:rFonts w:ascii="Calibri" w:hAnsi="Calibri"/>
+                <w:b w:val="0"/>
+                <w:i w:val="0"/>
+                <w:color w:val="000000"/>
+                <w:sz w:val="16"/>
+              </w:rPr>
+              <w:t>2</w:t>
+            </w:r>
+          </w:p>
+        </w:tc>
+        <w:tc>
+          <w:tcPr>
+            <w:tcW w:type="dxa" w:w="785"/>
+            <w:tcBorders>
+              <w:top w:val="single" w:sz="4" w:space="0" w:color="808080"/>
+              <w:left w:val="single" w:sz="4" w:space="0" w:color="808080"/>
+              <w:bottom w:val="single" w:sz="4" w:space="0" w:color="808080"/>
+              <w:right w:val="single" w:sz="4" w:space="0" w:color="808080"/>
+            </w:tcBorders>
+          </w:tcPr>
+          <w:p>
+            <w:pPr>
+              <w:spacing w:before="20" w:after="20"/>
+              <w:jc w:val="left"/>
+            </w:pPr>
+            <w:r>
+              <w:rPr>
+                <w:rFonts w:ascii="Calibri" w:hAnsi="Calibri"/>
+                <w:b w:val="0"/>
+                <w:i w:val="0"/>
+                <w:color w:val="000000"/>
+                <w:sz w:val="16"/>
+              </w:rPr>
+              <w:t>1</w:t>
+            </w:r>
+          </w:p>
+        </w:tc>
+        <w:tc>
+          <w:tcPr>
+            <w:tcW w:type="dxa" w:w="785"/>
+            <w:tcBorders>
+              <w:top w:val="single" w:sz="4" w:space="0" w:color="808080"/>
+              <w:left w:val="single" w:sz="4" w:space="0" w:color="808080"/>
+              <w:bottom w:val="single" w:sz="4" w:space="0" w:color="808080"/>
+              <w:right w:val="single" w:sz="4" w:space="0" w:color="808080"/>
+            </w:tcBorders>
+          </w:tcPr>
+          <w:p>
+            <w:pPr>
+              <w:spacing w:before="20" w:after="20"/>
+              <w:jc w:val="left"/>
+            </w:pPr>
+          </w:p>
+        </w:tc>
+        <w:tc>
+          <w:tcPr>
+            <w:tcW w:type="dxa" w:w="785"/>
+            <w:tcBorders>
+              <w:top w:val="single" w:sz="4" w:space="0" w:color="808080"/>
+              <w:left w:val="single" w:sz="4" w:space="0" w:color="808080"/>
+              <w:bottom w:val="single" w:sz="4" w:space="0" w:color="808080"/>
+              <w:right w:val="single" w:sz="4" w:space="0" w:color="808080"/>
+            </w:tcBorders>
+          </w:tcPr>
+          <w:p>
+            <w:pPr>
+              <w:spacing w:before="20" w:after="20"/>
+              <w:jc w:val="left"/>
+            </w:pPr>
+          </w:p>
+        </w:tc>
+        <w:tc>
+          <w:tcPr>
+            <w:tcW w:type="dxa" w:w="1682"/>
+            <w:tcBorders>
+              <w:top w:val="single" w:sz="4" w:space="0" w:color="808080"/>
+              <w:left w:val="single" w:sz="4" w:space="0" w:color="808080"/>
+              <w:bottom w:val="single" w:sz="4" w:space="0" w:color="808080"/>
+              <w:right w:val="single" w:sz="4" w:space="0" w:color="808080"/>
+            </w:tcBorders>
+          </w:tcPr>
+          <w:p>
+            <w:pPr>
+              <w:spacing w:before="20" w:after="20"/>
+              <w:jc w:val="left"/>
+            </w:pPr>
+            <w:r>
+              <w:rPr>
+                <w:rFonts w:ascii="Calibri" w:hAnsi="Calibri"/>
+                <w:b w:val="0"/>
+                <w:i w:val="0"/>
+                <w:color w:val="000000"/>
+                <w:sz w:val="16"/>
+              </w:rPr>
+              <w:t>ø14 nervürlü</w:t>
+            </w:r>
+          </w:p>
+        </w:tc>
+        <w:tc>
+          <w:tcPr>
+            <w:tcW w:type="dxa" w:w="1234"/>
+            <w:tcBorders>
+              <w:top w:val="single" w:sz="4" w:space="0" w:color="808080"/>
+              <w:left w:val="single" w:sz="4" w:space="0" w:color="808080"/>
+              <w:bottom w:val="single" w:sz="4" w:space="0" w:color="808080"/>
+              <w:right w:val="single" w:sz="4" w:space="0" w:color="808080"/>
+            </w:tcBorders>
+          </w:tcPr>
+          <w:p>
+            <w:pPr>
+              <w:spacing w:before="20" w:after="20"/>
+              <w:jc w:val="left"/>
+            </w:pPr>
+            <w:r>
+              <w:rPr>
+                <w:rFonts w:ascii="Calibri" w:hAnsi="Calibri"/>
+                <w:b w:val="0"/>
+                <w:i w:val="0"/>
+                <w:color w:val="000000"/>
+                <w:sz w:val="16"/>
+              </w:rPr>
+              <w:t>0,085700</w:t>
+            </w:r>
+          </w:p>
+        </w:tc>
+        <w:tc>
+          <w:tcPr>
+            <w:tcW w:type="dxa" w:w="1234"/>
+            <w:tcBorders>
+              <w:top w:val="single" w:sz="4" w:space="0" w:color="808080"/>
+              <w:left w:val="single" w:sz="4" w:space="0" w:color="808080"/>
+              <w:bottom w:val="single" w:sz="4" w:space="0" w:color="808080"/>
+              <w:right w:val="single" w:sz="4" w:space="0" w:color="808080"/>
+            </w:tcBorders>
+          </w:tcPr>
+          <w:p>
+            <w:pPr>
+              <w:spacing w:before="20" w:after="20"/>
+              <w:jc w:val="left"/>
+            </w:pPr>
+            <w:r>
+              <w:rPr>
+                <w:rFonts w:ascii="Calibri" w:hAnsi="Calibri"/>
+                <w:b w:val="0"/>
+                <w:i w:val="0"/>
+                <w:color w:val="000000"/>
+                <w:sz w:val="16"/>
+              </w:rPr>
+              <w:t>0,171400</w:t>
+            </w:r>
+          </w:p>
+        </w:tc>
+      </w:tr>
+      <w:tr>
+        <w:tc>
+          <w:tcPr>
+            <w:tcW w:type="dxa" w:w="1178"/>
+            <w:tcBorders>
+              <w:top w:val="single" w:sz="4" w:space="0" w:color="808080"/>
+              <w:left w:val="single" w:sz="4" w:space="0" w:color="808080"/>
+              <w:bottom w:val="single" w:sz="4" w:space="0" w:color="808080"/>
+              <w:right w:val="single" w:sz="4" w:space="0" w:color="808080"/>
+            </w:tcBorders>
+          </w:tcPr>
+          <w:p>
+            <w:pPr>
+              <w:spacing w:before="20" w:after="20"/>
+              <w:jc w:val="left"/>
+            </w:pPr>
+          </w:p>
+        </w:tc>
+        <w:tc>
+          <w:tcPr>
+            <w:tcW w:type="dxa" w:w="1346"/>
+            <w:tcBorders>
+              <w:top w:val="single" w:sz="4" w:space="0" w:color="808080"/>
+              <w:left w:val="single" w:sz="4" w:space="0" w:color="808080"/>
+              <w:bottom w:val="single" w:sz="4" w:space="0" w:color="808080"/>
+              <w:right w:val="single" w:sz="4" w:space="0" w:color="808080"/>
+            </w:tcBorders>
+          </w:tcPr>
+          <w:p>
+            <w:pPr>
+              <w:spacing w:before="20" w:after="20"/>
+              <w:jc w:val="left"/>
+            </w:pPr>
+            <w:r>
+              <w:rPr>
+                <w:rFonts w:ascii="Calibri" w:hAnsi="Calibri"/>
+                <w:b/>
+                <w:i w:val="0"/>
+                <w:color w:val="000000"/>
+                <w:sz w:val="16"/>
+              </w:rPr>
+              <w:t>M28 GENEL TOPLAM</w:t>
+            </w:r>
+          </w:p>
+        </w:tc>
+        <w:tc>
+          <w:tcPr>
+            <w:tcW w:type="dxa" w:w="617"/>
+            <w:tcBorders>
+              <w:top w:val="single" w:sz="4" w:space="0" w:color="808080"/>
+              <w:left w:val="single" w:sz="4" w:space="0" w:color="808080"/>
+              <w:bottom w:val="single" w:sz="4" w:space="0" w:color="808080"/>
+              <w:right w:val="single" w:sz="4" w:space="0" w:color="808080"/>
+            </w:tcBorders>
+          </w:tcPr>
+          <w:p>
+            <w:pPr>
+              <w:spacing w:before="20" w:after="20"/>
+              <w:jc w:val="left"/>
+            </w:pPr>
+            <w:r>
+              <w:rPr>
+                <w:rFonts w:ascii="Calibri" w:hAnsi="Calibri"/>
+                <w:b w:val="0"/>
+                <w:i w:val="0"/>
+                <w:color w:val="000000"/>
+                <w:sz w:val="16"/>
+              </w:rPr>
+              <w:t>ton</w:t>
+            </w:r>
+          </w:p>
+        </w:tc>
+        <w:tc>
+          <w:tcPr>
+            <w:tcW w:type="dxa" w:w="785"/>
+            <w:tcBorders>
+              <w:top w:val="single" w:sz="4" w:space="0" w:color="808080"/>
+              <w:left w:val="single" w:sz="4" w:space="0" w:color="808080"/>
+              <w:bottom w:val="single" w:sz="4" w:space="0" w:color="808080"/>
+              <w:right w:val="single" w:sz="4" w:space="0" w:color="808080"/>
+            </w:tcBorders>
+          </w:tcPr>
+          <w:p>
+            <w:pPr>
+              <w:spacing w:before="20" w:after="20"/>
+              <w:jc w:val="left"/>
+            </w:pPr>
+          </w:p>
+        </w:tc>
+        <w:tc>
+          <w:tcPr>
+            <w:tcW w:type="dxa" w:w="785"/>
+            <w:tcBorders>
+              <w:top w:val="single" w:sz="4" w:space="0" w:color="808080"/>
+              <w:left w:val="single" w:sz="4" w:space="0" w:color="808080"/>
+              <w:bottom w:val="single" w:sz="4" w:space="0" w:color="808080"/>
+              <w:right w:val="single" w:sz="4" w:space="0" w:color="808080"/>
+            </w:tcBorders>
+          </w:tcPr>
+          <w:p>
+            <w:pPr>
+              <w:spacing w:before="20" w:after="20"/>
+              <w:jc w:val="left"/>
+            </w:pPr>
+          </w:p>
+        </w:tc>
+        <w:tc>
+          <w:tcPr>
+            <w:tcW w:type="dxa" w:w="785"/>
+            <w:tcBorders>
+              <w:top w:val="single" w:sz="4" w:space="0" w:color="808080"/>
+              <w:left w:val="single" w:sz="4" w:space="0" w:color="808080"/>
+              <w:bottom w:val="single" w:sz="4" w:space="0" w:color="808080"/>
+              <w:right w:val="single" w:sz="4" w:space="0" w:color="808080"/>
+            </w:tcBorders>
+          </w:tcPr>
+          <w:p>
+            <w:pPr>
+              <w:spacing w:before="20" w:after="20"/>
+              <w:jc w:val="left"/>
+            </w:pPr>
+          </w:p>
+        </w:tc>
+        <w:tc>
+          <w:tcPr>
+            <w:tcW w:type="dxa" w:w="785"/>
+            <w:tcBorders>
+              <w:top w:val="single" w:sz="4" w:space="0" w:color="808080"/>
+              <w:left w:val="single" w:sz="4" w:space="0" w:color="808080"/>
+              <w:bottom w:val="single" w:sz="4" w:space="0" w:color="808080"/>
+              <w:right w:val="single" w:sz="4" w:space="0" w:color="808080"/>
+            </w:tcBorders>
+          </w:tcPr>
+          <w:p>
+            <w:pPr>
+              <w:spacing w:before="20" w:after="20"/>
+              <w:jc w:val="left"/>
+            </w:pPr>
+          </w:p>
+        </w:tc>
+        <w:tc>
+          <w:tcPr>
+            <w:tcW w:type="dxa" w:w="1682"/>
+            <w:tcBorders>
+              <w:top w:val="single" w:sz="4" w:space="0" w:color="808080"/>
+              <w:left w:val="single" w:sz="4" w:space="0" w:color="808080"/>
+              <w:bottom w:val="single" w:sz="4" w:space="0" w:color="808080"/>
+              <w:right w:val="single" w:sz="4" w:space="0" w:color="808080"/>
+            </w:tcBorders>
+          </w:tcPr>
+          <w:p>
+            <w:pPr>
+              <w:spacing w:before="20" w:after="20"/>
+              <w:jc w:val="left"/>
+            </w:pPr>
+          </w:p>
+        </w:tc>
+        <w:tc>
+          <w:tcPr>
+            <w:tcW w:type="dxa" w:w="1234"/>
+            <w:tcBorders>
+              <w:top w:val="single" w:sz="4" w:space="0" w:color="808080"/>
+              <w:left w:val="single" w:sz="4" w:space="0" w:color="808080"/>
+              <w:bottom w:val="single" w:sz="4" w:space="0" w:color="808080"/>
+              <w:right w:val="single" w:sz="4" w:space="0" w:color="808080"/>
+            </w:tcBorders>
+          </w:tcPr>
+          <w:p>
+            <w:pPr>
+              <w:spacing w:before="20" w:after="20"/>
+              <w:jc w:val="left"/>
+            </w:pPr>
+          </w:p>
+        </w:tc>
+        <w:tc>
+          <w:tcPr>
+            <w:tcW w:type="dxa" w:w="1234"/>
+            <w:tcBorders>
+              <w:top w:val="single" w:sz="4" w:space="0" w:color="808080"/>
+              <w:left w:val="single" w:sz="4" w:space="0" w:color="808080"/>
+              <w:bottom w:val="single" w:sz="4" w:space="0" w:color="808080"/>
+              <w:right w:val="single" w:sz="4" w:space="0" w:color="808080"/>
+            </w:tcBorders>
+          </w:tcPr>
+          <w:p>
+            <w:pPr>
+              <w:spacing w:before="20" w:after="20"/>
+              <w:jc w:val="left"/>
+            </w:pPr>
+            <w:r>
+              <w:rPr>
+                <w:rFonts w:ascii="Calibri" w:hAnsi="Calibri"/>
+                <w:b w:val="0"/>
+                <w:i w:val="0"/>
+                <w:color w:val="000000"/>
+                <w:sz w:val="16"/>
+              </w:rPr>
+              <w:t>0,356800</w:t>
             </w:r>
           </w:p>
         </w:tc>
@@ -26288,7 +27368,7 @@
                 <w:color w:val="000000"/>
                 <w:sz w:val="16"/>
               </w:rPr>
-              <w:t>4,875600</w:t>
+              <w:t>4,661480</w:t>
             </w:r>
           </w:p>
         </w:tc>
@@ -27825,7 +28905,7 @@
                 <w:color w:val="000000"/>
                 <w:sz w:val="16"/>
               </w:rPr>
-              <w:t>4,875600</w:t>
+              <w:t>4,661480</w:t>
             </w:r>
           </w:p>
         </w:tc>

</xml_diff>

<commit_message>
Yayın: metraj cetveli yapı bazında ayrı nüshalar (METRAJ-YAPI-BAZINDA)
Dokuz yapı için ayrı PDF ve Word; toplu nüsha yerinde. Türkçe büyük harf
düzeltmesi yapı bantlarına işlendi. 91 -> 109 belge.

Co-Authored-By: Claude Opus 5 <noreply@anthropic.com>
Claude-Session: https://claude.ai/code/session_01HJPp6bx7wepUX5p8fxGcjg
</commit_message>
<xml_diff>
--- a/belgeler/04_METRAJ_CETVELI_AGIRLIK.docx
+++ b/belgeler/04_METRAJ_CETVELI_AGIRLIK.docx
@@ -24042,7 +24042,7 @@
                 <w:color w:val="000000"/>
                 <w:sz w:val="16"/>
               </w:rPr>
-              <w:t>Yapı/Bina Adı: YEM SILOSU BETONARME KAIDELERI</w:t>
+              <w:t>Yapı/Bina Adı: YEM SİLOSU BETONARME KAİDELERİ</w:t>
             </w:r>
           </w:p>
         </w:tc>
@@ -28957,7 +28957,7 @@
                 <w:color w:val="000000"/>
                 <w:sz w:val="16"/>
               </w:rPr>
-              <w:t>Yapı/Bina Adı: ÇEVRE DÜZENLEMESI VE SAHA ALTYAPISI</w:t>
+              <w:t>Yapı/Bina Adı: ÇEVRE DÜZENLEMESİ VE SAHA ALTYAPISI</w:t>
             </w:r>
           </w:p>
         </w:tc>

</xml_diff>